<commit_message>
Atualiza documentos de resposta ao CEP
</commit_message>
<xml_diff>
--- a/CEP_resposta_pendencia_8477643/04_termo_transferencia_informacoes.docx
+++ b/CEP_resposta_pendencia_8477643/04_termo_transferencia_informacoes.docx
@@ -1,21 +1,21 @@
 
 <file path=word/document.xml><?xml version="1.0" encoding="utf-8"?>
-<w:document xmlns:w="http://schemas.openxmlformats.org/wordprocessingml/2006/main" xmlns:m="http://schemas.openxmlformats.org/officeDocument/2006/math" xmlns:r="http://schemas.openxmlformats.org/officeDocument/2006/relationships" xmlns:o="urn:schemas-microsoft-com:office:office" xmlns:v="urn:schemas-microsoft-com:vml" xmlns:w10="urn:schemas-microsoft-com:office:word" xmlns:a="http://schemas.openxmlformats.org/drawingml/2006/main" xmlns:pic="http://schemas.openxmlformats.org/drawingml/2006/picture" xmlns:wp="http://schemas.openxmlformats.org/drawingml/2006/wordprocessingDrawing">
+<w:document xmlns:wpc="http://schemas.microsoft.com/office/word/2010/wordprocessingCanvas" xmlns:cx="http://schemas.microsoft.com/office/drawing/2014/chartex" xmlns:cx1="http://schemas.microsoft.com/office/drawing/2015/9/8/chartex" xmlns:cx2="http://schemas.microsoft.com/office/drawing/2015/10/21/chartex" xmlns:cx3="http://schemas.microsoft.com/office/drawing/2016/5/9/chartex" xmlns:cx4="http://schemas.microsoft.com/office/drawing/2016/5/10/chartex" xmlns:cx5="http://schemas.microsoft.com/office/drawing/2016/5/11/chartex" xmlns:cx6="http://schemas.microsoft.com/office/drawing/2016/5/12/chartex" xmlns:cx7="http://schemas.microsoft.com/office/drawing/2016/5/13/chartex" xmlns:cx8="http://schemas.microsoft.com/office/drawing/2016/5/14/chartex" xmlns:mc="http://schemas.openxmlformats.org/markup-compatibility/2006" xmlns:aink="http://schemas.microsoft.com/office/drawing/2016/ink" xmlns:am3d="http://schemas.microsoft.com/office/drawing/2017/model3d" xmlns:o="urn:schemas-microsoft-com:office:office" xmlns:oel="http://schemas.microsoft.com/office/2019/extlst" xmlns:r="http://schemas.openxmlformats.org/officeDocument/2006/relationships" xmlns:m="http://schemas.openxmlformats.org/officeDocument/2006/math" xmlns:v="urn:schemas-microsoft-com:vml" xmlns:wp14="http://schemas.microsoft.com/office/word/2010/wordprocessingDrawing" xmlns:wp="http://schemas.openxmlformats.org/drawingml/2006/wordprocessingDrawing" xmlns:w10="urn:schemas-microsoft-com:office:word" xmlns:w="http://schemas.openxmlformats.org/wordprocessingml/2006/main" xmlns:w14="http://schemas.microsoft.com/office/word/2010/wordml" xmlns:w15="http://schemas.microsoft.com/office/word/2012/wordml" xmlns:w16cex="http://schemas.microsoft.com/office/word/2018/wordml/cex" xmlns:w16cid="http://schemas.microsoft.com/office/word/2016/wordml/cid" xmlns:w16="http://schemas.microsoft.com/office/word/2018/wordml" xmlns:w16sdtdh="http://schemas.microsoft.com/office/word/2020/wordml/sdtdatahash" xmlns:w16se="http://schemas.microsoft.com/office/word/2015/wordml/symex" xmlns:wpg="http://schemas.microsoft.com/office/word/2010/wordprocessingGroup" xmlns:wpi="http://schemas.microsoft.com/office/word/2010/wordprocessingInk" xmlns:wne="http://schemas.microsoft.com/office/word/2006/wordml" xmlns:wps="http://schemas.microsoft.com/office/word/2010/wordprocessingShape" mc:Ignorable="w14 w15 w16se w16cid w16 w16cex w16sdtdh wp14">
   <w:body>
     <w:p>
       <w:pPr>
-        <w:pStyle w:val="Title"/>
-      </w:pPr>
-      <w:r>
-        <w:t xml:space="preserve">Termo de Transferência de Informações</w:t>
-      </w:r>
-    </w:p>
-    <w:p>
-      <w:pPr>
-        <w:pStyle w:val="Subtitle"/>
-      </w:pPr>
-      <w:r>
-        <w:t xml:space="preserve">Resolução CNS nº 738/2024</w:t>
+        <w:pStyle w:val="Ttulo"/>
+      </w:pPr>
+      <w:r>
+        <w:t>Termo de Transferência de Informações</w:t>
+      </w:r>
+    </w:p>
+    <w:p>
+      <w:pPr>
+        <w:pStyle w:val="Subttulo"/>
+      </w:pPr>
+      <w:r>
+        <w:t>Resolução CNS nº 738/2024</w:t>
       </w:r>
     </w:p>
     <w:p>
@@ -23,16 +23,21 @@
         <w:pStyle w:val="Author"/>
       </w:pPr>
       <w:r>
-        <w:t xml:space="preserve">Secretaria Municipal de Saúde de Rondonópolis-MT e Universidade Federal de Rondonópolis</w:t>
-      </w:r>
-    </w:p>
-    <w:p>
-      <w:pPr>
-        <w:pStyle w:val="Date"/>
-      </w:pPr>
-      <w:r>
-        <w:t xml:space="preserve">2026-06-07</w:t>
-      </w:r>
+        <w:t>Secretaria Municipal de Saúde de Rondonópolis-MT e Universidade Federal de Rondonópolis</w:t>
+      </w:r>
+    </w:p>
+    <w:p>
+      <w:pPr>
+        <w:pStyle w:val="Data"/>
+      </w:pPr>
+      <w:r>
+        <w:t>2026-06-07</w:t>
+      </w:r>
+    </w:p>
+    <w:p>
+      <w:pPr>
+        <w:pStyle w:val="Corpodetexto"/>
+      </w:pPr>
     </w:p>
     <w:p>
       <w:pPr>
@@ -43,13 +48,10 @@
           <w:b/>
           <w:bCs/>
         </w:rPr>
-        <w:t xml:space="preserve">Projeto:</w:t>
-      </w:r>
-      <w:r>
-        <w:t xml:space="preserve"> </w:t>
-      </w:r>
-      <w:r>
-        <w:t xml:space="preserve">Desenvolvimento Participativo de Dashboards para Apoio à Gestão em Saúde Mental: uma pesquisa de Action Design Research em um CAPSij</w:t>
+        <w:t>Projeto:</w:t>
+      </w:r>
+      <w:r>
+        <w:t xml:space="preserve"> Desenvolvimento Participativo de Dashboards para Apoio à Gestão em Saúde Mental: uma pesquisa de Action Design Research em um CAPSij</w:t>
       </w:r>
       <w:r>
         <w:br/>
@@ -59,13 +61,10 @@
           <w:b/>
           <w:bCs/>
         </w:rPr>
-        <w:t xml:space="preserve">CAAE:</w:t>
-      </w:r>
-      <w:r>
-        <w:t xml:space="preserve"> </w:t>
-      </w:r>
-      <w:r>
-        <w:t xml:space="preserve">98308126.4.0000.0126</w:t>
+        <w:t>CAAE:</w:t>
+      </w:r>
+      <w:r>
+        <w:t xml:space="preserve"> 98308126.4.0000.0126</w:t>
       </w:r>
       <w:r>
         <w:br/>
@@ -75,13 +74,10 @@
           <w:b/>
           <w:bCs/>
         </w:rPr>
-        <w:t xml:space="preserve">Pesquisador responsável:</w:t>
-      </w:r>
-      <w:r>
-        <w:t xml:space="preserve"> </w:t>
-      </w:r>
-      <w:r>
-        <w:t xml:space="preserve">Djalma Barbosa</w:t>
+        <w:t>Pesquisador responsável:</w:t>
+      </w:r>
+      <w:r>
+        <w:t xml:space="preserve"> Djalma Barbosa</w:t>
       </w:r>
       <w:r>
         <w:br/>
@@ -91,13 +87,10 @@
           <w:b/>
           <w:bCs/>
         </w:rPr>
-        <w:t xml:space="preserve">Instituição proponente:</w:t>
-      </w:r>
-      <w:r>
-        <w:t xml:space="preserve"> </w:t>
-      </w:r>
-      <w:r>
-        <w:t xml:space="preserve">Universidade Federal de Rondonópolis (UFR)</w:t>
+        <w:t>Instituição proponente:</w:t>
+      </w:r>
+      <w:r>
+        <w:t xml:space="preserve"> Universidade Federal de Rondonópolis (UFR)</w:t>
       </w:r>
       <w:r>
         <w:br/>
@@ -107,13 +100,10 @@
           <w:b/>
           <w:bCs/>
         </w:rPr>
-        <w:t xml:space="preserve">Controladora dos dados de origem:</w:t>
-      </w:r>
-      <w:r>
-        <w:t xml:space="preserve"> </w:t>
-      </w:r>
-      <w:r>
-        <w:t xml:space="preserve">Secretaria Municipal de Saúde de Rondonópolis-MT</w:t>
+        <w:t>Instituição anuente/controladora dos dados de origem:</w:t>
+      </w:r>
+      <w:r>
+        <w:t xml:space="preserve"> Prefeitura Municipal de Rondonópolis / Secretaria Municipal de Saúde / Educação Permanente em Saúde</w:t>
       </w:r>
       <w:r>
         <w:br/>
@@ -123,258 +113,239 @@
           <w:b/>
           <w:bCs/>
         </w:rPr>
-        <w:t xml:space="preserve">Unidade de origem/guarda operacional:</w:t>
-      </w:r>
-      <w:r>
-        <w:t xml:space="preserve"> </w:t>
-      </w:r>
-      <w:r>
-        <w:t xml:space="preserve">CAPSij de Rondonópolis-MT</w:t>
-      </w:r>
-    </w:p>
-    <w:p>
-      <w:pPr>
-        <w:pStyle w:val="BodyText"/>
-      </w:pPr>
-      <w:r>
-        <w:t xml:space="preserve">Pelo presente Termo de Transferência de Informações, a</w:t>
-      </w:r>
-      <w:r>
-        <w:t xml:space="preserve"> </w:t>
+        <w:t>Unidade de origem/guarda operacional:</w:t>
+      </w:r>
+      <w:r>
+        <w:t xml:space="preserve"> CAPSij de Rondonópolis-MT</w:t>
+      </w:r>
+      <w:r>
+        <w:br/>
       </w:r>
       <w:r>
         <w:rPr>
           <w:b/>
           <w:bCs/>
         </w:rPr>
-        <w:t xml:space="preserve">Secretaria Municipal de Saúde de Rondonópolis-MT</w:t>
-      </w:r>
-      <w:r>
-        <w:t xml:space="preserve">, na qualidade de Controladora dos bancos de dados assistenciais e administrativos já constituídos no âmbito do CAPSij, e o pesquisador responsável</w:t>
-      </w:r>
-      <w:r>
-        <w:t xml:space="preserve"> </w:t>
+        <w:t>Endereço institucional constante na Carta de Anuência:</w:t>
+      </w:r>
+      <w:r>
+        <w:t xml:space="preserve"> Rua Rio Branco, nº 2916, Bairro Jardim Santa Marta, CEP 78.700-310, Rondonópolis-MT; telefone (66) 3410-0208; e-mail educacaopermanentemsrondon@gmail.com</w:t>
+      </w:r>
+    </w:p>
+    <w:p>
+      <w:pPr>
+        <w:pStyle w:val="Corpodetexto"/>
+        <w:jc w:val="both"/>
+      </w:pPr>
+      <w:r>
+        <w:t xml:space="preserve">Pelo presente Termo de Transferência de Informações, a </w:t>
       </w:r>
       <w:r>
         <w:rPr>
           <w:b/>
           <w:bCs/>
         </w:rPr>
-        <w:t xml:space="preserve">Djalma Barbosa</w:t>
-      </w:r>
-      <w:r>
-        <w:t xml:space="preserve">, vinculado à Universidade Federal de Rondonópolis (UFR), formalizam as condições para transferência, recebimento, guarda e uso dos dados necessários à execução do projeto acima identificado, em conformidade com a Resolução CNS nº 738/2024 e com o protocolo aprovado pelo CEP/UFR.</w:t>
-      </w:r>
-    </w:p>
-    <w:bookmarkStart w:id="20" w:name="partes"/>
-    <w:p>
-      <w:pPr>
-        <w:pStyle w:val="Heading1"/>
-      </w:pPr>
-      <w:r>
-        <w:t xml:space="preserve">Partes</w:t>
-      </w:r>
-    </w:p>
-    <w:p>
-      <w:pPr>
-        <w:pStyle w:val="FirstParagraph"/>
-      </w:pPr>
+        <w:t>Secretaria Municipal de Saúde de Rondonópolis-MT / Educação Permanente em Saúde</w:t>
+      </w:r>
+      <w:r>
+        <w:t xml:space="preserve">, na qualidade de instituição anuente vinculada à Controladora dos bancos de dados assistenciais e administrativos já constituídos no âmbito do CAPSij, e o pesquisador responsável </w:t>
+      </w:r>
       <w:r>
         <w:rPr>
           <w:b/>
           <w:bCs/>
         </w:rPr>
-        <w:t xml:space="preserve">Transmitente/Controladora dos dados:</w:t>
-      </w:r>
-      <w:r>
-        <w:t xml:space="preserve"> </w:t>
-      </w:r>
-      <w:r>
-        <w:t xml:space="preserve">Secretaria Municipal de Saúde de Rondonópolis-MT, CNPJ nº</w:t>
-      </w:r>
-      <w:r>
-        <w:t xml:space="preserve"> </w:t>
-      </w:r>
+        <w:t>Djalma Barbosa</w:t>
+      </w:r>
+      <w:r>
+        <w:t>, vinculado à Universidade Federal de Rondonópolis (UFR), formalizam as condições para transferência, recebimento, guarda e uso dos dados necessários à execução do projeto acima identificado, em conformidade com a Resolução CNS nº 738/2024, a Lei Geral de Proteção de Dados Pessoais (Lei nº 13.709/2018), o Decreto Municipal nº 10.789/2022, a Política de Privacidade da Prefeitura de Rondonópolis e o protocolo aprovado pelo CEP/UFR.</w:t>
+      </w:r>
+    </w:p>
+    <w:p>
+      <w:pPr>
+        <w:pStyle w:val="Ttulo1"/>
+        <w:jc w:val="both"/>
+      </w:pPr>
+      <w:bookmarkStart w:id="0" w:name="partes"/>
+      <w:r>
+        <w:t>Partes</w:t>
+      </w:r>
+    </w:p>
+    <w:p>
+      <w:pPr>
+        <w:pStyle w:val="FirstParagraph"/>
+        <w:jc w:val="both"/>
+      </w:pPr>
       <w:r>
         <w:rPr>
           <w:b/>
           <w:bCs/>
         </w:rPr>
-        <w:t xml:space="preserve">[CNPJ]</w:t>
-      </w:r>
-      <w:r>
-        <w:t xml:space="preserve">, com sede em</w:t>
-      </w:r>
-      <w:r>
-        <w:t xml:space="preserve"> </w:t>
+        <w:t>Transmitente/instituição anuente vinculada à Controladora dos dados:</w:t>
+      </w:r>
+      <w:r>
+        <w:t xml:space="preserve"> Prefeitura Municipal de Rondonópolis / Secretaria Municipal de Saúde / Educação Permanente em Saúde, situada na Rua Rio Branco, nº 2916, Bairro Jardim Santa Marta, CEP 78.700-310, Rondonópolis-MT, telefone (66) 3410-0208, e-mail educacaopermanentemsrondon@gmail.com, representada por </w:t>
       </w:r>
       <w:r>
         <w:rPr>
           <w:b/>
           <w:bCs/>
         </w:rPr>
-        <w:t xml:space="preserve">[endereço]</w:t>
-      </w:r>
-      <w:r>
-        <w:t xml:space="preserve">, representada por</w:t>
-      </w:r>
-      <w:r>
-        <w:t xml:space="preserve"> </w:t>
+        <w:t>Me. Edinaldo Santos de Souza</w:t>
+      </w:r>
+      <w:r>
+        <w:t xml:space="preserve">, </w:t>
       </w:r>
       <w:r>
         <w:rPr>
           <w:b/>
           <w:bCs/>
         </w:rPr>
-        <w:t xml:space="preserve">[nome completo]</w:t>
-      </w:r>
-      <w:r>
-        <w:t xml:space="preserve">,</w:t>
-      </w:r>
-      <w:r>
-        <w:t xml:space="preserve"> </w:t>
+        <w:t>Coordenador da Educação Permanente em Saúde</w:t>
+      </w:r>
+      <w:r>
+        <w:t xml:space="preserve">, matrícula nº </w:t>
       </w:r>
       <w:r>
         <w:rPr>
           <w:b/>
           <w:bCs/>
         </w:rPr>
-        <w:t xml:space="preserve">[cargo]</w:t>
-      </w:r>
-      <w:r>
-        <w:t xml:space="preserve">, CPF nº</w:t>
-      </w:r>
-      <w:r>
-        <w:t xml:space="preserve"> </w:t>
+        <w:t>12572</w:t>
+      </w:r>
+      <w:r>
+        <w:t xml:space="preserve">, CPF nº </w:t>
       </w:r>
       <w:r>
         <w:rPr>
           <w:b/>
           <w:bCs/>
         </w:rPr>
-        <w:t xml:space="preserve">[CPF]</w:t>
-      </w:r>
-      <w:r>
-        <w:t xml:space="preserve">.</w:t>
-      </w:r>
-    </w:p>
-    <w:p>
-      <w:pPr>
-        <w:pStyle w:val="BodyText"/>
+        <w:t>[preencher, se exigido]</w:t>
+      </w:r>
+      <w:r>
+        <w:t>.</w:t>
+      </w:r>
+    </w:p>
+    <w:p>
+      <w:pPr>
+        <w:pStyle w:val="Corpodetexto"/>
+        <w:jc w:val="both"/>
       </w:pPr>
       <w:r>
         <w:rPr>
           <w:b/>
           <w:bCs/>
         </w:rPr>
-        <w:t xml:space="preserve">Unidade de origem/guarda operacional:</w:t>
-      </w:r>
-      <w:r>
-        <w:t xml:space="preserve"> </w:t>
-      </w:r>
-      <w:r>
-        <w:t xml:space="preserve">CAPSij de Rondonópolis-MT, representado por</w:t>
-      </w:r>
-      <w:r>
-        <w:t xml:space="preserve"> </w:t>
+        <w:lastRenderedPageBreak/>
+        <w:t>Unidade de origem/guarda operacional:</w:t>
+      </w:r>
+      <w:r>
+        <w:t xml:space="preserve"> CAPSij de Rondonópolis-MT, representado por </w:t>
       </w:r>
       <w:r>
         <w:rPr>
           <w:b/>
           <w:bCs/>
         </w:rPr>
-        <w:t xml:space="preserve">[nome completo]</w:t>
-      </w:r>
-      <w:r>
-        <w:t xml:space="preserve">,</w:t>
-      </w:r>
-      <w:r>
-        <w:t xml:space="preserve"> </w:t>
+        <w:t>[nome completo]</w:t>
+      </w:r>
+      <w:r>
+        <w:t xml:space="preserve">, </w:t>
       </w:r>
       <w:r>
         <w:rPr>
           <w:b/>
           <w:bCs/>
         </w:rPr>
-        <w:t xml:space="preserve">[cargo]</w:t>
-      </w:r>
-      <w:r>
-        <w:t xml:space="preserve">, CPF nº</w:t>
-      </w:r>
-      <w:r>
-        <w:t xml:space="preserve"> </w:t>
+        <w:t>[cargo]</w:t>
+      </w:r>
+      <w:r>
+        <w:t xml:space="preserve">, CPF nº </w:t>
       </w:r>
       <w:r>
         <w:rPr>
           <w:b/>
           <w:bCs/>
         </w:rPr>
-        <w:t xml:space="preserve">[CPF]</w:t>
-      </w:r>
-      <w:r>
-        <w:t xml:space="preserve">, quando aplicável.</w:t>
-      </w:r>
-    </w:p>
-    <w:p>
-      <w:pPr>
-        <w:pStyle w:val="BodyText"/>
+        <w:t>[CPF]</w:t>
+      </w:r>
+      <w:r>
+        <w:t>, quando aplicável.</w:t>
+      </w:r>
+    </w:p>
+    <w:p>
+      <w:pPr>
+        <w:pStyle w:val="Corpodetexto"/>
+        <w:jc w:val="both"/>
       </w:pPr>
       <w:r>
         <w:rPr>
           <w:b/>
           <w:bCs/>
         </w:rPr>
-        <w:t xml:space="preserve">Recebedor/Pesquisador responsável:</w:t>
-      </w:r>
-      <w:r>
-        <w:t xml:space="preserve"> </w:t>
-      </w:r>
-      <w:r>
-        <w:t xml:space="preserve">Djalma Barbosa, vinculado à Universidade Federal de Rondonópolis (UFR), responsável pela condução ética e científica do projeto aprovado pelo CEP/UFR.</w:t>
-      </w:r>
-    </w:p>
-    <w:bookmarkEnd w:id="20"/>
-    <w:bookmarkStart w:id="21" w:name="objeto-da-transferência"/>
-    <w:p>
-      <w:pPr>
-        <w:pStyle w:val="Heading1"/>
-      </w:pPr>
-      <w:r>
-        <w:t xml:space="preserve">Objeto da transferência</w:t>
+        <w:t>Recebedor/Pesquisador responsável:</w:t>
+      </w:r>
+      <w:r>
+        <w:t xml:space="preserve"> Djalma Barbosa, vinculado à Universidade Federal de Rondonópolis (UFR), responsável pela condução ética e científica do projeto aprovado pelo CEP/UFR, sem geração de ônus financeiro para a Secretaria Municipal de Saúde de Rondonópolis-MT.</w:t>
+      </w:r>
+    </w:p>
+    <w:p>
+      <w:pPr>
+        <w:pStyle w:val="Ttulo1"/>
+        <w:jc w:val="both"/>
+      </w:pPr>
+      <w:bookmarkStart w:id="1" w:name="objeto-da-transferência"/>
+      <w:bookmarkEnd w:id="0"/>
+      <w:r>
+        <w:t>Objeto da transferência</w:t>
       </w:r>
     </w:p>
     <w:p>
       <w:pPr>
         <w:pStyle w:val="FirstParagraph"/>
-      </w:pPr>
-      <w:r>
-        <w:t xml:space="preserve">Poderão ser transferidos ou disponibilizados ao pesquisador responsável, nos limites estritamente necessários à pesquisa, dados assistenciais e administrativos já existentes no âmbito do CAPSij, incluindo relatórios, planilhas internas, registros administrativos, indicadores de atendimento, informações de produção assistencial e demais dados necessários ao mapeamento de fluxos, qualificação de indicadores e desenvolvimento do dashboard.</w:t>
-      </w:r>
-    </w:p>
-    <w:p>
-      <w:pPr>
-        <w:pStyle w:val="BodyText"/>
-      </w:pPr>
-      <w:r>
-        <w:t xml:space="preserve">A transferência deverá ocorrer, sempre que tecnicamente possível, em formato agregado, anonimizado ou sem identificadores diretos. A transferência de dados identificáveis somente ocorrerá quando indispensável para preparação, limpeza, vinculação ou validação de registros, mediante autorização da Controladora e acesso restrito à equipe formalmente autorizada.</w:t>
-      </w:r>
-    </w:p>
-    <w:bookmarkEnd w:id="21"/>
-    <w:bookmarkStart w:id="22" w:name="finalidade"/>
-    <w:p>
-      <w:pPr>
-        <w:pStyle w:val="Heading1"/>
-      </w:pPr>
-      <w:r>
-        <w:t xml:space="preserve">Finalidade</w:t>
+        <w:jc w:val="both"/>
+      </w:pPr>
+      <w:r>
+        <w:t>Poderão ser transferidos ou disponibilizados ao pesquisador responsável, nos limites estritamente necessários à pesquisa, dados assistenciais e administrativos já existentes no âmbito do CAPSij, incluindo relatórios, planilhas internas, registros administrativos, indicadores de atendimento, informações de produção assistencial e demais dados necessários ao mapeamento de fluxos, qualificação de indicadores e desenvolvimento do dashboard.</w:t>
+      </w:r>
+    </w:p>
+    <w:p>
+      <w:pPr>
+        <w:pStyle w:val="Corpodetexto"/>
+        <w:jc w:val="both"/>
+      </w:pPr>
+      <w:r>
+        <w:t>A transferência deverá ocorrer, sempre que tecnicamente possível, em formato agregado, anonimizado ou sem identificadores diretos. A transferência de dados identificáveis somente ocorrerá quando indispensável para preparação, limpeza, vinculação ou validação de registros, mediante autorização da Controladora e acesso restrito à equipe formalmente autorizada.</w:t>
+      </w:r>
+    </w:p>
+    <w:p>
+      <w:pPr>
+        <w:pStyle w:val="Corpodetexto"/>
+        <w:jc w:val="both"/>
+      </w:pPr>
+      <w:r>
+        <w:t>Este termo não autoriza qualquer transferência ou acesso a dados antes da emissão de parecer favorável pelo CEP/UFR. Após a aprovação ética, a transferência ocorrerá apenas nos limites autorizados pela Controladora dos dados e pelo protocolo aprovado.</w:t>
+      </w:r>
+    </w:p>
+    <w:p>
+      <w:pPr>
+        <w:pStyle w:val="Ttulo1"/>
+        <w:jc w:val="both"/>
+      </w:pPr>
+      <w:bookmarkStart w:id="2" w:name="finalidade"/>
+      <w:bookmarkEnd w:id="1"/>
+      <w:r>
+        <w:t>Finalidade</w:t>
       </w:r>
     </w:p>
     <w:p>
       <w:pPr>
         <w:pStyle w:val="FirstParagraph"/>
-      </w:pPr>
-      <w:r>
-        <w:t xml:space="preserve">Os dados serão utilizados exclusivamente para:</w:t>
+        <w:jc w:val="both"/>
+      </w:pPr>
+      <w:r>
+        <w:t>Os dados serão utilizados exclusivamente para:</w:t>
       </w:r>
     </w:p>
     <w:p>
@@ -382,11 +353,12 @@
         <w:pStyle w:val="Compact"/>
         <w:numPr>
           <w:ilvl w:val="0"/>
-          <w:numId w:val="1001"/>
+          <w:numId w:val="2"/>
         </w:numPr>
-      </w:pPr>
-      <w:r>
-        <w:t xml:space="preserve">mapear fontes, fluxos, qualidade e disponibilidade dos dados do CAPSij;</w:t>
+        <w:jc w:val="both"/>
+      </w:pPr>
+      <w:r>
+        <w:t>mapear fontes, fluxos, qualidade e disponibilidade dos dados do CAPSij;</w:t>
       </w:r>
     </w:p>
     <w:p>
@@ -394,11 +366,12 @@
         <w:pStyle w:val="Compact"/>
         <w:numPr>
           <w:ilvl w:val="0"/>
-          <w:numId w:val="1001"/>
+          <w:numId w:val="2"/>
         </w:numPr>
-      </w:pPr>
-      <w:r>
-        <w:t xml:space="preserve">apoiar a definição participativa de indicadores e requisitos do dashboard;</w:t>
+        <w:jc w:val="both"/>
+      </w:pPr>
+      <w:r>
+        <w:t>apoiar a definição participativa de indicadores e requisitos do dashboard;</w:t>
       </w:r>
     </w:p>
     <w:p>
@@ -406,11 +379,12 @@
         <w:pStyle w:val="Compact"/>
         <w:numPr>
           <w:ilvl w:val="0"/>
-          <w:numId w:val="1001"/>
+          <w:numId w:val="2"/>
         </w:numPr>
-      </w:pPr>
-      <w:r>
-        <w:t xml:space="preserve">desenvolver, testar e validar protótipos de dashboard em nível agregado;</w:t>
+        <w:jc w:val="both"/>
+      </w:pPr>
+      <w:r>
+        <w:t>desenvolver, testar e validar protótipos de dashboard em nível agregado;</w:t>
       </w:r>
     </w:p>
     <w:p>
@@ -418,11 +392,12 @@
         <w:pStyle w:val="Compact"/>
         <w:numPr>
           <w:ilvl w:val="0"/>
-          <w:numId w:val="1001"/>
+          <w:numId w:val="2"/>
         </w:numPr>
-      </w:pPr>
-      <w:r>
-        <w:t xml:space="preserve">avaliar a utilidade, usabilidade e incorporação do dashboard na rotina de gestão;</w:t>
+        <w:jc w:val="both"/>
+      </w:pPr>
+      <w:r>
+        <w:t>avaliar a utilidade, usabilidade e incorporação do dashboard na rotina de gestão;</w:t>
       </w:r>
     </w:p>
     <w:p>
@@ -430,29 +405,12 @@
         <w:pStyle w:val="Compact"/>
         <w:numPr>
           <w:ilvl w:val="0"/>
-          <w:numId w:val="1001"/>
+          <w:numId w:val="2"/>
         </w:numPr>
-      </w:pPr>
-      <w:r>
-        <w:t xml:space="preserve">produzir relatórios técnicos, publicações acadêmicas e produtos científicos sem divulgação identificável.</w:t>
-      </w:r>
-    </w:p>
-    <w:bookmarkEnd w:id="22"/>
-    <w:bookmarkStart w:id="23" w:name="Xb4edf744fc667dfa6f1b1da171eed2a05c998a6"/>
-    <w:p>
-      <w:pPr>
-        <w:pStyle w:val="Heading1"/>
-      </w:pPr>
-      <w:r>
-        <w:t xml:space="preserve">Condições de segurança e confidencialidade</w:t>
-      </w:r>
-    </w:p>
-    <w:p>
-      <w:pPr>
-        <w:pStyle w:val="FirstParagraph"/>
-      </w:pPr>
-      <w:r>
-        <w:t xml:space="preserve">O pesquisador responsável compromete-se a:</w:t>
+        <w:jc w:val="both"/>
+      </w:pPr>
+      <w:r>
+        <w:t>produzir relatórios técnicos, publicações acadêmicas e produtos científicos sem divulgação identificável;</w:t>
       </w:r>
     </w:p>
     <w:p>
@@ -460,11 +418,33 @@
         <w:pStyle w:val="Compact"/>
         <w:numPr>
           <w:ilvl w:val="0"/>
-          <w:numId w:val="1002"/>
+          <w:numId w:val="2"/>
         </w:numPr>
-      </w:pPr>
-      <w:r>
-        <w:t xml:space="preserve">utilizar os dados exclusivamente para os objetivos aprovados pelo CEP/UFR;</w:t>
+        <w:jc w:val="both"/>
+      </w:pPr>
+      <w:r>
+        <w:t>apresentar à Secretaria Municipal de Saúde de Rondonópolis-MT os resultados obtidos ao final do trabalho, em formato compatível com a finalidade institucional e sem exposição de dados identificáveis.</w:t>
+      </w:r>
+    </w:p>
+    <w:p>
+      <w:pPr>
+        <w:pStyle w:val="Ttulo1"/>
+        <w:jc w:val="both"/>
+      </w:pPr>
+      <w:bookmarkStart w:id="3" w:name="Xb4edf744fc667dfa6f1b1da171eed2a05c998a6"/>
+      <w:bookmarkEnd w:id="2"/>
+      <w:r>
+        <w:lastRenderedPageBreak/>
+        <w:t>Condições de segurança e confidencialidade</w:t>
+      </w:r>
+    </w:p>
+    <w:p>
+      <w:pPr>
+        <w:pStyle w:val="FirstParagraph"/>
+        <w:jc w:val="both"/>
+      </w:pPr>
+      <w:r>
+        <w:t>O pesquisador responsável compromete-se a:</w:t>
       </w:r>
     </w:p>
     <w:p>
@@ -472,11 +452,12 @@
         <w:pStyle w:val="Compact"/>
         <w:numPr>
           <w:ilvl w:val="0"/>
-          <w:numId w:val="1002"/>
+          <w:numId w:val="3"/>
         </w:numPr>
-      </w:pPr>
-      <w:r>
-        <w:t xml:space="preserve">restringir o acesso aos dados a integrantes autorizados e signatários do TCUD;</w:t>
+        <w:jc w:val="both"/>
+      </w:pPr>
+      <w:r>
+        <w:t>utilizar os dados exclusivamente para os objetivos aprovados pelo CEP/UFR;</w:t>
       </w:r>
     </w:p>
     <w:p>
@@ -484,11 +465,12 @@
         <w:pStyle w:val="Compact"/>
         <w:numPr>
           <w:ilvl w:val="0"/>
-          <w:numId w:val="1002"/>
+          <w:numId w:val="3"/>
         </w:numPr>
-      </w:pPr>
-      <w:r>
-        <w:t xml:space="preserve">armazenar os dados em ambiente seguro, com acesso controlado;</w:t>
+        <w:jc w:val="both"/>
+      </w:pPr>
+      <w:r>
+        <w:t>restringir o acesso aos dados a integrantes autorizados e signatários do TCUD;</w:t>
       </w:r>
     </w:p>
     <w:p>
@@ -496,11 +478,12 @@
         <w:pStyle w:val="Compact"/>
         <w:numPr>
           <w:ilvl w:val="0"/>
-          <w:numId w:val="1002"/>
+          <w:numId w:val="3"/>
         </w:numPr>
-      </w:pPr>
-      <w:r>
-        <w:t xml:space="preserve">não compartilhar bases brutas, identificáveis ou potencialmente identificáveis com terceiros não autorizados;</w:t>
+        <w:jc w:val="both"/>
+      </w:pPr>
+      <w:r>
+        <w:t>assegurar que qualquer atividade de coleta, produção, transmissão, distribuição, processamento, arquivamento, armazenamento, eliminação, avaliação, controle, modificação, comunicação, transferência, difusão ou extração de dados pessoais esteja em conformidade com a LGPD, com o Decreto Municipal nº 10.789/2022, com a Política de Privacidade da Prefeitura de Rondonópolis e com as medidas de privacidade e segurança previstas no protocolo;</w:t>
       </w:r>
     </w:p>
     <w:p>
@@ -508,11 +491,12 @@
         <w:pStyle w:val="Compact"/>
         <w:numPr>
           <w:ilvl w:val="0"/>
-          <w:numId w:val="1002"/>
+          <w:numId w:val="3"/>
         </w:numPr>
-      </w:pPr>
-      <w:r>
-        <w:t xml:space="preserve">retirar, separar, anonimizar ou suprimir identificadores diretos assim que deixarem de ser indispensáveis;</w:t>
+        <w:jc w:val="both"/>
+      </w:pPr>
+      <w:r>
+        <w:t>armazenar os dados em ambiente seguro, com acesso controlado;</w:t>
       </w:r>
     </w:p>
     <w:p>
@@ -520,11 +504,12 @@
         <w:pStyle w:val="Compact"/>
         <w:numPr>
           <w:ilvl w:val="0"/>
-          <w:numId w:val="1002"/>
+          <w:numId w:val="3"/>
         </w:numPr>
-      </w:pPr>
-      <w:r>
-        <w:t xml:space="preserve">divulgar resultados apenas em forma agregada, anonimizada ou sem risco razoável de reidentificação;</w:t>
+        <w:jc w:val="both"/>
+      </w:pPr>
+      <w:r>
+        <w:t>não compartilhar bases brutas, identificáveis ou potencialmente identificáveis com terceiros não autorizados;</w:t>
       </w:r>
     </w:p>
     <w:p>
@@ -532,11 +517,12 @@
         <w:pStyle w:val="Compact"/>
         <w:numPr>
           <w:ilvl w:val="0"/>
-          <w:numId w:val="1002"/>
+          <w:numId w:val="3"/>
         </w:numPr>
-      </w:pPr>
-      <w:r>
-        <w:t xml:space="preserve">adotar supressão ou agrupamento de células pequenas, categorias raras ou combinações de variáveis que possam permitir identificação indireta;</w:t>
+        <w:jc w:val="both"/>
+      </w:pPr>
+      <w:r>
+        <w:t>retirar, separar, anonimizar ou suprimir identificadores diretos assim que deixarem de ser indispensáveis;</w:t>
       </w:r>
     </w:p>
     <w:p>
@@ -544,29 +530,12 @@
         <w:pStyle w:val="Compact"/>
         <w:numPr>
           <w:ilvl w:val="0"/>
-          <w:numId w:val="1002"/>
+          <w:numId w:val="3"/>
         </w:numPr>
-      </w:pPr>
-      <w:r>
-        <w:t xml:space="preserve">comunicar à Controladora e ao CEP/UFR qualquer incidente, acesso indevido, perda, exposição acidental ou suspeita de violação de sigilo.</w:t>
-      </w:r>
-    </w:p>
-    <w:bookmarkEnd w:id="23"/>
-    <w:bookmarkStart w:id="24" w:name="vedações"/>
-    <w:p>
-      <w:pPr>
-        <w:pStyle w:val="Heading1"/>
-      </w:pPr>
-      <w:r>
-        <w:t xml:space="preserve">Vedações</w:t>
-      </w:r>
-    </w:p>
-    <w:p>
-      <w:pPr>
-        <w:pStyle w:val="FirstParagraph"/>
-      </w:pPr>
-      <w:r>
-        <w:t xml:space="preserve">É vedado utilizar os dados transferidos para:</w:t>
+        <w:jc w:val="both"/>
+      </w:pPr>
+      <w:r>
+        <w:t>divulgar resultados apenas em forma agregada, anonimizada ou sem risco razoável de reidentificação;</w:t>
       </w:r>
     </w:p>
     <w:p>
@@ -574,11 +543,12 @@
         <w:pStyle w:val="Compact"/>
         <w:numPr>
           <w:ilvl w:val="0"/>
-          <w:numId w:val="1003"/>
+          <w:numId w:val="3"/>
         </w:numPr>
-      </w:pPr>
-      <w:r>
-        <w:t xml:space="preserve">avaliação individual de trabalhadores, usuários ou familiares;</w:t>
+        <w:jc w:val="both"/>
+      </w:pPr>
+      <w:r>
+        <w:t>adotar supressão ou agrupamento de células pequenas, categorias raras ou combinações de variáveis que possam permitir identificação indireta;</w:t>
       </w:r>
     </w:p>
     <w:p>
@@ -586,11 +556,32 @@
         <w:pStyle w:val="Compact"/>
         <w:numPr>
           <w:ilvl w:val="0"/>
-          <w:numId w:val="1003"/>
+          <w:numId w:val="3"/>
         </w:numPr>
-      </w:pPr>
-      <w:r>
-        <w:t xml:space="preserve">fiscalização punitiva;</w:t>
+        <w:jc w:val="both"/>
+      </w:pPr>
+      <w:r>
+        <w:t>comunicar à Controladora, à Secretaria Municipal de Saúde/Educação Permanente em Saúde e ao CEP/UFR qualquer incidente, acesso indevido, perda, exposição acidental ou suspeita de violação de sigilo.</w:t>
+      </w:r>
+    </w:p>
+    <w:p>
+      <w:pPr>
+        <w:pStyle w:val="Ttulo1"/>
+        <w:jc w:val="both"/>
+      </w:pPr>
+      <w:bookmarkStart w:id="4" w:name="vedações"/>
+      <w:bookmarkEnd w:id="3"/>
+      <w:r>
+        <w:t>Vedações</w:t>
+      </w:r>
+    </w:p>
+    <w:p>
+      <w:pPr>
+        <w:pStyle w:val="FirstParagraph"/>
+        <w:jc w:val="both"/>
+      </w:pPr>
+      <w:r>
+        <w:t>É vedado utilizar os dados transferidos para:</w:t>
       </w:r>
     </w:p>
     <w:p>
@@ -598,11 +589,12 @@
         <w:pStyle w:val="Compact"/>
         <w:numPr>
           <w:ilvl w:val="0"/>
-          <w:numId w:val="1003"/>
+          <w:numId w:val="4"/>
         </w:numPr>
-      </w:pPr>
-      <w:r>
-        <w:t xml:space="preserve">tomada de decisão clínica individual;</w:t>
+        <w:jc w:val="both"/>
+      </w:pPr>
+      <w:r>
+        <w:t>avaliação individual de trabalhadores, usuários ou familiares;</w:t>
       </w:r>
     </w:p>
     <w:p>
@@ -610,11 +602,12 @@
         <w:pStyle w:val="Compact"/>
         <w:numPr>
           <w:ilvl w:val="0"/>
-          <w:numId w:val="1003"/>
+          <w:numId w:val="4"/>
         </w:numPr>
-      </w:pPr>
-      <w:r>
-        <w:t xml:space="preserve">divulgação de bases identificáveis;</w:t>
+        <w:jc w:val="both"/>
+      </w:pPr>
+      <w:r>
+        <w:t>fiscalização punitiva;</w:t>
       </w:r>
     </w:p>
     <w:p>
@@ -622,11 +615,12 @@
         <w:pStyle w:val="Compact"/>
         <w:numPr>
           <w:ilvl w:val="0"/>
-          <w:numId w:val="1003"/>
+          <w:numId w:val="4"/>
         </w:numPr>
-      </w:pPr>
-      <w:r>
-        <w:t xml:space="preserve">tentativa de reidentificação de pessoas;</w:t>
+        <w:jc w:val="both"/>
+      </w:pPr>
+      <w:r>
+        <w:t>tomada de decisão clínica individual;</w:t>
       </w:r>
     </w:p>
     <w:p>
@@ -634,61 +628,106 @@
         <w:pStyle w:val="Compact"/>
         <w:numPr>
           <w:ilvl w:val="0"/>
-          <w:numId w:val="1003"/>
+          <w:numId w:val="4"/>
         </w:numPr>
-      </w:pPr>
-      <w:r>
-        <w:t xml:space="preserve">finalidade diversa daquela aprovada pelo CEP/UFR.</w:t>
-      </w:r>
-    </w:p>
-    <w:bookmarkEnd w:id="24"/>
-    <w:bookmarkStart w:id="25" w:name="vigência-e-guarda"/>
-    <w:p>
-      <w:pPr>
-        <w:pStyle w:val="Heading1"/>
-      </w:pPr>
-      <w:r>
-        <w:t xml:space="preserve">Vigência e guarda</w:t>
+        <w:jc w:val="both"/>
+      </w:pPr>
+      <w:r>
+        <w:t>divulgação de bases identificáveis;</w:t>
+      </w:r>
+    </w:p>
+    <w:p>
+      <w:pPr>
+        <w:pStyle w:val="Compact"/>
+        <w:numPr>
+          <w:ilvl w:val="0"/>
+          <w:numId w:val="4"/>
+        </w:numPr>
+        <w:jc w:val="both"/>
+      </w:pPr>
+      <w:r>
+        <w:t>tentativa de reidentificação de pessoas;</w:t>
+      </w:r>
+    </w:p>
+    <w:p>
+      <w:pPr>
+        <w:pStyle w:val="Compact"/>
+        <w:numPr>
+          <w:ilvl w:val="0"/>
+          <w:numId w:val="4"/>
+        </w:numPr>
+        <w:jc w:val="both"/>
+      </w:pPr>
+      <w:r>
+        <w:t>finalidade diversa daquela aprovada pelo CEP/UFR.</w:t>
+      </w:r>
+    </w:p>
+    <w:p>
+      <w:pPr>
+        <w:pStyle w:val="Ttulo1"/>
+        <w:jc w:val="both"/>
+      </w:pPr>
+      <w:bookmarkStart w:id="5" w:name="vigência-e-guarda"/>
+      <w:bookmarkEnd w:id="4"/>
+      <w:r>
+        <w:t>Vigência e guarda</w:t>
       </w:r>
     </w:p>
     <w:p>
       <w:pPr>
         <w:pStyle w:val="FirstParagraph"/>
-      </w:pPr>
-      <w:r>
-        <w:t xml:space="preserve">Este termo terá vigência durante a execução da pesquisa e pelo período de guarda previsto no protocolo aprovado pelo CEP/UFR. Ao final do prazo de retenção, os dados identificáveis eventualmente mantidos deverão ser descartados de forma segura, salvo exigência normativa, determinação institucional ou orientação do CEP/UFR em sentido diverso.</w:t>
-      </w:r>
-    </w:p>
-    <w:bookmarkEnd w:id="25"/>
-    <w:bookmarkStart w:id="26" w:name="condição-ética"/>
-    <w:p>
-      <w:pPr>
-        <w:pStyle w:val="Heading1"/>
-      </w:pPr>
-      <w:r>
-        <w:t xml:space="preserve">Condição ética</w:t>
+        <w:jc w:val="both"/>
+      </w:pPr>
+      <w:r>
+        <w:t xml:space="preserve">Este termo terá vigência durante a execução da pesquisa e pelo período de guarda previsto no protocolo aprovado pelo CEP/UFR. Ao final do prazo de retenção, os dados identificáveis eventualmente mantidos deverão ser descartados de forma </w:t>
+      </w:r>
+      <w:r>
+        <w:lastRenderedPageBreak/>
+        <w:t>segura, salvo exigência normativa, determinação institucional ou orientação do CEP/UFR em sentido diverso.</w:t>
+      </w:r>
+    </w:p>
+    <w:p>
+      <w:pPr>
+        <w:pStyle w:val="Ttulo1"/>
+        <w:jc w:val="both"/>
+      </w:pPr>
+      <w:bookmarkStart w:id="6" w:name="condição-ética"/>
+      <w:bookmarkEnd w:id="5"/>
+      <w:r>
+        <w:t>Condição ética</w:t>
       </w:r>
     </w:p>
     <w:p>
       <w:pPr>
         <w:pStyle w:val="FirstParagraph"/>
-      </w:pPr>
-      <w:r>
-        <w:t xml:space="preserve">A transferência ou acesso aos dados somente poderá ocorrer após emissão de parecer favorável pelo CEP/UFR e nos limites autorizados pela Controladora dos dados.</w:t>
-      </w:r>
-    </w:p>
-    <w:p>
-      <w:pPr>
-        <w:pStyle w:val="BodyText"/>
-      </w:pPr>
-      <w:r>
-        <w:t xml:space="preserve">Rondonópolis-MT, ____ de __________________ de 2026.</w:t>
-      </w:r>
-    </w:p>
-    <w:p>
-      <w:r>
-        <w:pict>
-          <v:rect style="width:0;height:1.5pt" o:hralign="center" o:hrstd="t" o:hr="t"/>
+        <w:jc w:val="both"/>
+      </w:pPr>
+      <w:r>
+        <w:t>A transferência ou acesso aos dados somente poderá ocorrer após emissão de parecer favorável pelo CEP/UFR e nos limites autorizados pela Controladora dos dados.</w:t>
+      </w:r>
+    </w:p>
+    <w:p>
+      <w:pPr>
+        <w:pStyle w:val="Corpodetexto"/>
+        <w:jc w:val="both"/>
+      </w:pPr>
+      <w:r>
+        <w:t>O presente termo observa a anuência institucional emitida pela Educação Permanente em Saúde da Secretaria Municipal de Saúde de Rondonópolis-MT em 13 de maio de 2026, na qual foi autorizado o projeto de pesquisa acima identificado e registrado que sua execução não implicará ônus para a Secretaria Municipal de Saúde.</w:t>
+      </w:r>
+    </w:p>
+    <w:p>
+      <w:pPr>
+        <w:pStyle w:val="Corpodetexto"/>
+        <w:jc w:val="both"/>
+      </w:pPr>
+      <w:r>
+        <w:t>Rondonópolis-MT, ____ de __________________ de 2026.</w:t>
+      </w:r>
+    </w:p>
+    <w:p>
+      <w:r>
+        <w:pict w14:anchorId="68AF5F3C">
+          <v:rect id="_x0000_i1025" style="width:0;height:1.5pt" o:hrstd="t" o:hr="t"/>
         </w:pict>
       </w:r>
     </w:p>
@@ -701,7 +740,7 @@
           <w:b/>
           <w:bCs/>
         </w:rPr>
-        <w:t xml:space="preserve">[Nome da autoridade institucional]</w:t>
+        <w:t>Me. Edinaldo Santos de Souza</w:t>
       </w:r>
       <w:r>
         <w:br/>
@@ -711,25 +750,25 @@
           <w:b/>
           <w:bCs/>
         </w:rPr>
-        <w:t xml:space="preserve">[Cargo]</w:t>
+        <w:t>Coordenador da Educação Permanente em Saúde</w:t>
       </w:r>
       <w:r>
         <w:br/>
-      </w:r>
-      <w:r>
-        <w:t xml:space="preserve">Secretaria Municipal de Saúde de Rondonópolis-MT</w:t>
+        <w:t>Matrícula nº 12572</w:t>
       </w:r>
       <w:r>
         <w:br/>
-      </w:r>
-      <w:r>
-        <w:t xml:space="preserve">Controladora dos dados</w:t>
-      </w:r>
-    </w:p>
-    <w:p>
-      <w:r>
-        <w:pict>
-          <v:rect style="width:0;height:1.5pt" o:hralign="center" o:hrstd="t" o:hr="t"/>
+        <w:t>Secretaria Municipal de Saúde de Rondonópolis-MT / Educação Permanente em Saúde</w:t>
+      </w:r>
+      <w:r>
+        <w:br/>
+        <w:t>Instituição anuente vinculada à Controladora dos dados</w:t>
+      </w:r>
+    </w:p>
+    <w:p>
+      <w:r>
+        <w:pict w14:anchorId="2AE568CD">
+          <v:rect id="_x0000_i1026" style="width:0;height:1.5pt" o:hrstd="t" o:hr="t"/>
         </w:pict>
       </w:r>
     </w:p>
@@ -742,7 +781,7 @@
           <w:b/>
           <w:bCs/>
         </w:rPr>
-        <w:t xml:space="preserve">[Nome da coordenação do CAPSij, se aplicável]</w:t>
+        <w:t>[Nome da coordenação do CAPSij, se aplicável]</w:t>
       </w:r>
       <w:r>
         <w:br/>
@@ -752,25 +791,21 @@
           <w:b/>
           <w:bCs/>
         </w:rPr>
-        <w:t xml:space="preserve">[Cargo]</w:t>
+        <w:t>[Cargo]</w:t>
       </w:r>
       <w:r>
         <w:br/>
-      </w:r>
-      <w:r>
-        <w:t xml:space="preserve">CAPSij de Rondonópolis-MT</w:t>
+        <w:t>CAPSij de Rondonópolis-MT</w:t>
       </w:r>
       <w:r>
         <w:br/>
-      </w:r>
-      <w:r>
-        <w:t xml:space="preserve">Unidade de origem/guarda operacional dos registros</w:t>
-      </w:r>
-    </w:p>
-    <w:p>
-      <w:r>
-        <w:pict>
-          <v:rect style="width:0;height:1.5pt" o:hralign="center" o:hrstd="t" o:hr="t"/>
+        <w:t>Unidade de origem/guarda operacional dos registros</w:t>
+      </w:r>
+    </w:p>
+    <w:p>
+      <w:r>
+        <w:pict w14:anchorId="3DF23872">
+          <v:rect id="_x0000_i1027" style="width:0;height:1.5pt" o:hrstd="t" o:hr="t"/>
         </w:pict>
       </w:r>
     </w:p>
@@ -783,59 +818,36 @@
           <w:b/>
           <w:bCs/>
         </w:rPr>
-        <w:t xml:space="preserve">Djalma Barbosa</w:t>
+        <w:t>Djalma Barbosa</w:t>
       </w:r>
       <w:r>
         <w:br/>
-      </w:r>
-      <w:r>
-        <w:t xml:space="preserve">Pesquisador responsável</w:t>
+        <w:t>Pesquisador responsável</w:t>
       </w:r>
       <w:r>
         <w:br/>
-      </w:r>
-      <w:r>
-        <w:t xml:space="preserve">Universidade Federal de Rondonópolis (UFR)</w:t>
-      </w:r>
-    </w:p>
-    <w:bookmarkEnd w:id="26"/>
+        <w:t>Universidade Federal de Rondonópolis (UFR)</w:t>
+      </w:r>
+      <w:bookmarkEnd w:id="6"/>
+    </w:p>
     <w:sectPr>
       <w:footnotePr>
         <w:numRestart w:val="eachSect"/>
       </w:footnotePr>
+      <w:pgSz w:w="12240" w:h="15840"/>
+      <w:pgMar w:top="1417" w:right="1701" w:bottom="1417" w:left="1701" w:header="720" w:footer="720" w:gutter="0"/>
+      <w:cols w:space="720"/>
     </w:sectPr>
   </w:body>
 </w:document>
 </file>
 
-<file path=word/comments.xml><?xml version="1.0" encoding="utf-8"?>
-<w:comments xmlns:w="http://schemas.openxmlformats.org/wordprocessingml/2006/main" xmlns:m="http://schemas.openxmlformats.org/officeDocument/2006/math" xmlns:r="http://schemas.openxmlformats.org/officeDocument/2006/relationships" xmlns:o="urn:schemas-microsoft-com:office:office" xmlns:v="urn:schemas-microsoft-com:vml" xmlns:w10="urn:schemas-microsoft-com:office:word" xmlns:a="http://schemas.openxmlformats.org/drawingml/2006/main" xmlns:pic="http://schemas.openxmlformats.org/drawingml/2006/picture" xmlns:wp="http://schemas.openxmlformats.org/drawingml/2006/wordprocessingDrawing"/>
-</file>
-
-<file path=word/footnotes.xml><?xml version="1.0" encoding="utf-8"?>
-<w:footnotes xmlns:w="http://schemas.openxmlformats.org/wordprocessingml/2006/main" xmlns:m="http://schemas.openxmlformats.org/officeDocument/2006/math" xmlns:r="http://schemas.openxmlformats.org/officeDocument/2006/relationships" xmlns:o="urn:schemas-microsoft-com:office:office" xmlns:v="urn:schemas-microsoft-com:vml" xmlns:w10="urn:schemas-microsoft-com:office:word" xmlns:a="http://schemas.openxmlformats.org/drawingml/2006/main" xmlns:pic="http://schemas.openxmlformats.org/drawingml/2006/picture" xmlns:wp="http://schemas.openxmlformats.org/drawingml/2006/wordprocessingDrawing">
-  <w:footnote w:type="continuationSeparator" w:id="0">
-    <w:p>
-      <w:r>
-        <w:continuationSeparator/>
-      </w:r>
-    </w:p>
-  </w:footnote>
-  <w:footnote w:type="separator" w:id="-1">
-    <w:p>
-      <w:r>
-        <w:separator/>
-      </w:r>
-    </w:p>
-  </w:footnote>
-</w:footnotes>
-</file>
-
 <file path=word/numbering.xml><?xml version="1.0" encoding="utf-8"?>
-<w:numbering xmlns:w="http://schemas.openxmlformats.org/wordprocessingml/2006/main">
-  <w:abstractNum w:abstractNumId="990">
+<w:numbering xmlns:wpc="http://schemas.microsoft.com/office/word/2010/wordprocessingCanvas" xmlns:cx="http://schemas.microsoft.com/office/drawing/2014/chartex" xmlns:cx1="http://schemas.microsoft.com/office/drawing/2015/9/8/chartex" xmlns:cx2="http://schemas.microsoft.com/office/drawing/2015/10/21/chartex" xmlns:cx3="http://schemas.microsoft.com/office/drawing/2016/5/9/chartex" xmlns:cx4="http://schemas.microsoft.com/office/drawing/2016/5/10/chartex" xmlns:cx5="http://schemas.microsoft.com/office/drawing/2016/5/11/chartex" xmlns:cx6="http://schemas.microsoft.com/office/drawing/2016/5/12/chartex" xmlns:cx7="http://schemas.microsoft.com/office/drawing/2016/5/13/chartex" xmlns:cx8="http://schemas.microsoft.com/office/drawing/2016/5/14/chartex" xmlns:mc="http://schemas.openxmlformats.org/markup-compatibility/2006" xmlns:aink="http://schemas.microsoft.com/office/drawing/2016/ink" xmlns:am3d="http://schemas.microsoft.com/office/drawing/2017/model3d" xmlns:o="urn:schemas-microsoft-com:office:office" xmlns:oel="http://schemas.microsoft.com/office/2019/extlst" xmlns:r="http://schemas.openxmlformats.org/officeDocument/2006/relationships" xmlns:m="http://schemas.openxmlformats.org/officeDocument/2006/math" xmlns:v="urn:schemas-microsoft-com:vml" xmlns:wp14="http://schemas.microsoft.com/office/word/2010/wordprocessingDrawing" xmlns:wp="http://schemas.openxmlformats.org/drawingml/2006/wordprocessingDrawing" xmlns:w10="urn:schemas-microsoft-com:office:word" xmlns:w="http://schemas.openxmlformats.org/wordprocessingml/2006/main" xmlns:w14="http://schemas.microsoft.com/office/word/2010/wordml" xmlns:w15="http://schemas.microsoft.com/office/word/2012/wordml" xmlns:w16cex="http://schemas.microsoft.com/office/word/2018/wordml/cex" xmlns:w16cid="http://schemas.microsoft.com/office/word/2016/wordml/cid" xmlns:w16="http://schemas.microsoft.com/office/word/2018/wordml" xmlns:w16sdtdh="http://schemas.microsoft.com/office/word/2020/wordml/sdtdatahash" xmlns:w16se="http://schemas.microsoft.com/office/word/2015/wordml/symex" xmlns:wpg="http://schemas.microsoft.com/office/word/2010/wordprocessingGroup" xmlns:wpi="http://schemas.microsoft.com/office/word/2010/wordprocessingInk" xmlns:wne="http://schemas.microsoft.com/office/word/2006/wordml" xmlns:wps="http://schemas.microsoft.com/office/word/2010/wordprocessingShape" mc:Ignorable="w14 w15 w16se w16cid w16 w16cex w16sdtdh wp14">
+  <w:abstractNum w:abstractNumId="0" w15:restartNumberingAfterBreak="0">
     <w:nsid w:val="0000A990"/>
     <w:multiLevelType w:val="multilevel"/>
+    <w:tmpl w:val="A5C035E4"/>
     <w:lvl w:ilvl="0">
       <w:numFmt w:val="bullet"/>
       <w:lvlText w:val=" "/>
@@ -909,9 +921,10 @@
       </w:pPr>
     </w:lvl>
   </w:abstractNum>
-  <w:abstractNum w:abstractNumId="99411">
+  <w:abstractNum w:abstractNumId="1" w15:restartNumberingAfterBreak="0">
     <w:nsid w:val="00A99411"/>
     <w:multiLevelType w:val="multilevel"/>
+    <w:tmpl w:val="0FD6C84A"/>
     <w:lvl w:ilvl="0">
       <w:start w:val="1"/>
       <w:numFmt w:val="decimal"/>
@@ -994,11 +1007,11 @@
       </w:pPr>
     </w:lvl>
   </w:abstractNum>
-  <w:num w:numId="1000">
-    <w:abstractNumId w:val="990"/>
+  <w:num w:numId="1" w16cid:durableId="1253667450">
+    <w:abstractNumId w:val="0"/>
   </w:num>
-  <w:num w:numId="1001">
-    <w:abstractNumId w:val="99411"/>
+  <w:num w:numId="2" w16cid:durableId="1552113533">
+    <w:abstractNumId w:val="1"/>
     <w:lvlOverride w:ilvl="0">
       <w:startOverride w:val="1"/>
     </w:lvlOverride>
@@ -1027,8 +1040,8 @@
       <w:startOverride w:val="1"/>
     </w:lvlOverride>
   </w:num>
-  <w:num w:numId="1002">
-    <w:abstractNumId w:val="99411"/>
+  <w:num w:numId="3" w16cid:durableId="945769340">
+    <w:abstractNumId w:val="1"/>
     <w:lvlOverride w:ilvl="0">
       <w:startOverride w:val="1"/>
     </w:lvlOverride>
@@ -1057,8 +1070,8 @@
       <w:startOverride w:val="1"/>
     </w:lvlOverride>
   </w:num>
-  <w:num w:numId="1003">
-    <w:abstractNumId w:val="99411"/>
+  <w:num w:numId="4" w16cid:durableId="1803307766">
+    <w:abstractNumId w:val="1"/>
     <w:lvlOverride w:ilvl="0">
       <w:startOverride w:val="1"/>
     </w:lvlOverride>
@@ -1091,14 +1104,14 @@
 </file>
 
 <file path=word/styles.xml><?xml version="1.0" encoding="utf-8"?>
-<w:styles xmlns:r="http://schemas.openxmlformats.org/officeDocument/2006/relationships" xmlns:w="http://schemas.openxmlformats.org/wordprocessingml/2006/main">
+<w:styles xmlns:mc="http://schemas.openxmlformats.org/markup-compatibility/2006" xmlns:r="http://schemas.openxmlformats.org/officeDocument/2006/relationships" xmlns:w="http://schemas.openxmlformats.org/wordprocessingml/2006/main" xmlns:w14="http://schemas.microsoft.com/office/word/2010/wordml" xmlns:w15="http://schemas.microsoft.com/office/word/2012/wordml" xmlns:w16cex="http://schemas.microsoft.com/office/word/2018/wordml/cex" xmlns:w16cid="http://schemas.microsoft.com/office/word/2016/wordml/cid" xmlns:w16="http://schemas.microsoft.com/office/word/2018/wordml" xmlns:w16sdtdh="http://schemas.microsoft.com/office/word/2020/wordml/sdtdatahash" xmlns:w16se="http://schemas.microsoft.com/office/word/2015/wordml/symex" mc:Ignorable="w14 w15 w16se w16cid w16 w16cex w16sdtdh">
   <w:docDefaults>
     <w:rPrDefault>
       <w:rPr>
-        <w:rFonts w:asciiTheme="minorHAnsi" w:cstheme="minorBidi" w:eastAsiaTheme="minorHAnsi" w:hAnsiTheme="minorHAnsi"/>
+        <w:rFonts w:asciiTheme="minorHAnsi" w:eastAsiaTheme="minorHAnsi" w:hAnsiTheme="minorHAnsi" w:cstheme="minorBidi"/>
         <w:sz w:val="24"/>
         <w:szCs w:val="24"/>
-        <w:lang w:bidi="ar-SA" w:eastAsia="en-US" w:val="pt-BR"/>
+        <w:lang w:val="pt-BR" w:eastAsia="en-US" w:bidi="ar-SA"/>
       </w:rPr>
     </w:rPrDefault>
     <w:pPrDefault>
@@ -1107,193 +1120,280 @@
       </w:pPr>
     </w:pPrDefault>
   </w:docDefaults>
-  <w:latentStyles w:count="276" w:defLockedState="0" w:defQFormat="0" w:defSemiHidden="0" w:defUIPriority="0" w:defUnhideWhenUsed="0"/>
-  <w:style w:default="1" w:styleId="Normal" w:type="paragraph">
+  <w:latentStyles w:defLockedState="0" w:defUIPriority="0" w:defSemiHidden="0" w:defUnhideWhenUsed="0" w:defQFormat="0" w:count="376">
+    <w:lsdException w:name="Normal Table" w:semiHidden="1" w:unhideWhenUsed="1"/>
+    <w:lsdException w:name="Table Simple 1" w:semiHidden="1" w:unhideWhenUsed="1"/>
+    <w:lsdException w:name="Table Simple 2" w:semiHidden="1" w:unhideWhenUsed="1"/>
+    <w:lsdException w:name="Table Simple 3" w:semiHidden="1" w:unhideWhenUsed="1"/>
+    <w:lsdException w:name="Table Classic 1" w:semiHidden="1" w:unhideWhenUsed="1"/>
+    <w:lsdException w:name="Table Classic 2" w:semiHidden="1" w:unhideWhenUsed="1"/>
+    <w:lsdException w:name="Table Classic 3" w:semiHidden="1" w:unhideWhenUsed="1"/>
+    <w:lsdException w:name="Table Classic 4" w:semiHidden="1" w:unhideWhenUsed="1"/>
+    <w:lsdException w:name="Table Colorful 1" w:semiHidden="1" w:unhideWhenUsed="1"/>
+    <w:lsdException w:name="Table Colorful 2" w:semiHidden="1" w:unhideWhenUsed="1"/>
+    <w:lsdException w:name="Table Colorful 3" w:semiHidden="1" w:unhideWhenUsed="1"/>
+    <w:lsdException w:name="Table Columns 1" w:semiHidden="1" w:unhideWhenUsed="1"/>
+    <w:lsdException w:name="Table Columns 2" w:semiHidden="1" w:unhideWhenUsed="1"/>
+    <w:lsdException w:name="Table Columns 3" w:semiHidden="1" w:unhideWhenUsed="1"/>
+    <w:lsdException w:name="Table Columns 4" w:semiHidden="1" w:unhideWhenUsed="1"/>
+    <w:lsdException w:name="Table Columns 5" w:semiHidden="1" w:unhideWhenUsed="1"/>
+    <w:lsdException w:name="Table Grid 1" w:semiHidden="1" w:unhideWhenUsed="1"/>
+    <w:lsdException w:name="Table Grid 2" w:semiHidden="1" w:unhideWhenUsed="1"/>
+    <w:lsdException w:name="Table Grid 3" w:semiHidden="1" w:unhideWhenUsed="1"/>
+    <w:lsdException w:name="Table Grid 4" w:semiHidden="1" w:unhideWhenUsed="1"/>
+    <w:lsdException w:name="Table Grid 5" w:semiHidden="1" w:unhideWhenUsed="1"/>
+    <w:lsdException w:name="Table Grid 6" w:semiHidden="1" w:unhideWhenUsed="1"/>
+    <w:lsdException w:name="Table Grid 7" w:semiHidden="1" w:unhideWhenUsed="1"/>
+    <w:lsdException w:name="Table Grid 8" w:semiHidden="1" w:unhideWhenUsed="1"/>
+    <w:lsdException w:name="Table List 1" w:semiHidden="1" w:unhideWhenUsed="1"/>
+    <w:lsdException w:name="Table List 2" w:semiHidden="1" w:unhideWhenUsed="1"/>
+    <w:lsdException w:name="Table List 3" w:semiHidden="1" w:unhideWhenUsed="1"/>
+    <w:lsdException w:name="Table List 4" w:semiHidden="1" w:unhideWhenUsed="1"/>
+    <w:lsdException w:name="Table List 5" w:semiHidden="1" w:unhideWhenUsed="1"/>
+    <w:lsdException w:name="Table List 6" w:semiHidden="1" w:unhideWhenUsed="1"/>
+    <w:lsdException w:name="Table List 7" w:semiHidden="1" w:unhideWhenUsed="1"/>
+    <w:lsdException w:name="Table List 8" w:semiHidden="1" w:unhideWhenUsed="1"/>
+    <w:lsdException w:name="Table 3D effects 1" w:semiHidden="1" w:unhideWhenUsed="1"/>
+    <w:lsdException w:name="Table 3D effects 2" w:semiHidden="1" w:unhideWhenUsed="1"/>
+    <w:lsdException w:name="Table 3D effects 3" w:semiHidden="1" w:unhideWhenUsed="1"/>
+    <w:lsdException w:name="Table Contemporary" w:semiHidden="1" w:unhideWhenUsed="1"/>
+    <w:lsdException w:name="Table Elegant" w:semiHidden="1" w:unhideWhenUsed="1"/>
+    <w:lsdException w:name="Table Professional" w:semiHidden="1" w:unhideWhenUsed="1"/>
+    <w:lsdException w:name="Table Subtle 1" w:semiHidden="1" w:unhideWhenUsed="1"/>
+    <w:lsdException w:name="Table Subtle 2" w:semiHidden="1" w:unhideWhenUsed="1"/>
+    <w:lsdException w:name="Table Web 1" w:semiHidden="1" w:unhideWhenUsed="1"/>
+    <w:lsdException w:name="Table Web 2" w:semiHidden="1" w:unhideWhenUsed="1"/>
+    <w:lsdException w:name="Table Web 3" w:semiHidden="1" w:unhideWhenUsed="1"/>
+    <w:lsdException w:name="Table Theme" w:semiHidden="1" w:unhideWhenUsed="1"/>
+    <w:lsdException w:name="Light Shading"/>
+    <w:lsdException w:name="Light List"/>
+    <w:lsdException w:name="Light Grid"/>
+    <w:lsdException w:name="Medium Shading 1"/>
+    <w:lsdException w:name="Medium Shading 2"/>
+    <w:lsdException w:name="Medium List 1"/>
+    <w:lsdException w:name="Medium List 2"/>
+    <w:lsdException w:name="Medium Grid 1"/>
+    <w:lsdException w:name="Medium Grid 2"/>
+    <w:lsdException w:name="Medium Grid 3"/>
+    <w:lsdException w:name="Dark List"/>
+    <w:lsdException w:name="Colorful Shading"/>
+    <w:lsdException w:name="Colorful List"/>
+    <w:lsdException w:name="Colorful Grid"/>
+    <w:lsdException w:name="Light Shading Accent 1"/>
+    <w:lsdException w:name="Light List Accent 1"/>
+    <w:lsdException w:name="Light Grid Accent 1"/>
+    <w:lsdException w:name="Medium Shading 1 Accent 1"/>
+    <w:lsdException w:name="Medium Shading 2 Accent 1"/>
+    <w:lsdException w:name="Medium List 1 Accent 1"/>
+    <w:lsdException w:name="Medium List 2 Accent 1"/>
+    <w:lsdException w:name="Medium Grid 1 Accent 1"/>
+    <w:lsdException w:name="Medium Grid 2 Accent 1"/>
+    <w:lsdException w:name="Medium Grid 3 Accent 1"/>
+    <w:lsdException w:name="Dark List Accent 1"/>
+    <w:lsdException w:name="Colorful Shading Accent 1"/>
+    <w:lsdException w:name="Colorful List Accent 1"/>
+    <w:lsdException w:name="Colorful Grid Accent 1"/>
+    <w:lsdException w:name="Light Shading Accent 2"/>
+    <w:lsdException w:name="Light List Accent 2"/>
+    <w:lsdException w:name="Light Grid Accent 2"/>
+    <w:lsdException w:name="Medium Shading 1 Accent 2"/>
+    <w:lsdException w:name="Medium Shading 2 Accent 2"/>
+    <w:lsdException w:name="Medium List 1 Accent 2"/>
+    <w:lsdException w:name="Medium List 2 Accent 2"/>
+    <w:lsdException w:name="Medium Grid 1 Accent 2"/>
+    <w:lsdException w:name="Medium Grid 2 Accent 2"/>
+    <w:lsdException w:name="Medium Grid 3 Accent 2"/>
+    <w:lsdException w:name="Dark List Accent 2"/>
+    <w:lsdException w:name="Colorful Shading Accent 2"/>
+    <w:lsdException w:name="Colorful List Accent 2"/>
+    <w:lsdException w:name="Colorful Grid Accent 2"/>
+    <w:lsdException w:name="Light Shading Accent 3"/>
+    <w:lsdException w:name="Light List Accent 3"/>
+    <w:lsdException w:name="Light Grid Accent 3"/>
+    <w:lsdException w:name="Medium Shading 1 Accent 3"/>
+    <w:lsdException w:name="Medium Shading 2 Accent 3"/>
+    <w:lsdException w:name="Medium List 1 Accent 3"/>
+    <w:lsdException w:name="Medium List 2 Accent 3"/>
+    <w:lsdException w:name="Medium Grid 1 Accent 3"/>
+    <w:lsdException w:name="Medium Grid 2 Accent 3"/>
+    <w:lsdException w:name="Medium Grid 3 Accent 3"/>
+    <w:lsdException w:name="Dark List Accent 3"/>
+    <w:lsdException w:name="Colorful Shading Accent 3"/>
+    <w:lsdException w:name="Colorful List Accent 3"/>
+    <w:lsdException w:name="Colorful Grid Accent 3"/>
+    <w:lsdException w:name="Light Shading Accent 4"/>
+    <w:lsdException w:name="Light List Accent 4"/>
+    <w:lsdException w:name="Light Grid Accent 4"/>
+    <w:lsdException w:name="Medium Shading 1 Accent 4"/>
+    <w:lsdException w:name="Medium Shading 2 Accent 4"/>
+    <w:lsdException w:name="Medium List 1 Accent 4"/>
+    <w:lsdException w:name="Medium List 2 Accent 4"/>
+    <w:lsdException w:name="Medium Grid 1 Accent 4"/>
+    <w:lsdException w:name="Medium Grid 2 Accent 4"/>
+    <w:lsdException w:name="Medium Grid 3 Accent 4"/>
+    <w:lsdException w:name="Dark List Accent 4"/>
+    <w:lsdException w:name="Colorful Shading Accent 4"/>
+    <w:lsdException w:name="Colorful List Accent 4"/>
+    <w:lsdException w:name="Colorful Grid Accent 4"/>
+    <w:lsdException w:name="Light Shading Accent 5"/>
+    <w:lsdException w:name="Light List Accent 5"/>
+    <w:lsdException w:name="Light Grid Accent 5"/>
+    <w:lsdException w:name="Medium Shading 1 Accent 5"/>
+    <w:lsdException w:name="Medium Shading 2 Accent 5"/>
+    <w:lsdException w:name="Medium List 1 Accent 5"/>
+    <w:lsdException w:name="Medium List 2 Accent 5"/>
+    <w:lsdException w:name="Medium Grid 1 Accent 5"/>
+    <w:lsdException w:name="Medium Grid 2 Accent 5"/>
+    <w:lsdException w:name="Medium Grid 3 Accent 5"/>
+    <w:lsdException w:name="Dark List Accent 5"/>
+    <w:lsdException w:name="Colorful Shading Accent 5"/>
+    <w:lsdException w:name="Colorful List Accent 5"/>
+    <w:lsdException w:name="Colorful Grid Accent 5"/>
+    <w:lsdException w:name="Light Shading Accent 6"/>
+    <w:lsdException w:name="Light List Accent 6"/>
+    <w:lsdException w:name="Light Grid Accent 6"/>
+    <w:lsdException w:name="Medium Shading 1 Accent 6"/>
+    <w:lsdException w:name="Medium Shading 2 Accent 6"/>
+    <w:lsdException w:name="Medium List 1 Accent 6"/>
+    <w:lsdException w:name="Medium List 2 Accent 6"/>
+    <w:lsdException w:name="Medium Grid 1 Accent 6"/>
+    <w:lsdException w:name="Medium Grid 2 Accent 6"/>
+    <w:lsdException w:name="Medium Grid 3 Accent 6"/>
+    <w:lsdException w:name="Dark List Accent 6"/>
+    <w:lsdException w:name="Colorful Shading Accent 6"/>
+    <w:lsdException w:name="Colorful List Accent 6"/>
+    <w:lsdException w:name="Colorful Grid Accent 6"/>
+    <w:lsdException w:name="Grid Table 4" w:uiPriority="49"/>
+    <w:lsdException w:name="Grid Table 5 Dark" w:uiPriority="50"/>
+    <w:lsdException w:name="Grid Table 6 Colorful" w:uiPriority="51"/>
+    <w:lsdException w:name="Grid Table 7 Colorful" w:uiPriority="52"/>
+    <w:lsdException w:name="Grid Table 1 Light Accent 1" w:uiPriority="46"/>
+    <w:lsdException w:name="Grid Table 2 Accent 1" w:uiPriority="47"/>
+    <w:lsdException w:name="Grid Table 3 Accent 1" w:uiPriority="48"/>
+    <w:lsdException w:name="Grid Table 4 Accent 1" w:uiPriority="49"/>
+    <w:lsdException w:name="Grid Table 5 Dark Accent 1" w:uiPriority="50"/>
+    <w:lsdException w:name="Grid Table 6 Colorful Accent 1" w:uiPriority="51"/>
+    <w:lsdException w:name="Grid Table 7 Colorful Accent 1" w:uiPriority="52"/>
+    <w:lsdException w:name="Grid Table 1 Light Accent 2" w:uiPriority="46"/>
+    <w:lsdException w:name="Grid Table 2 Accent 2" w:uiPriority="47"/>
+    <w:lsdException w:name="Grid Table 3 Accent 2" w:uiPriority="48"/>
+    <w:lsdException w:name="Grid Table 4 Accent 2" w:uiPriority="49"/>
+    <w:lsdException w:name="Grid Table 5 Dark Accent 2" w:uiPriority="50"/>
+    <w:lsdException w:name="Grid Table 6 Colorful Accent 2" w:uiPriority="51"/>
+    <w:lsdException w:name="Grid Table 7 Colorful Accent 2" w:uiPriority="52"/>
+    <w:lsdException w:name="Grid Table 1 Light Accent 3" w:uiPriority="46"/>
+    <w:lsdException w:name="Grid Table 2 Accent 3" w:uiPriority="47"/>
+    <w:lsdException w:name="Grid Table 3 Accent 3" w:uiPriority="48"/>
+    <w:lsdException w:name="Grid Table 4 Accent 3" w:uiPriority="49"/>
+    <w:lsdException w:name="Grid Table 5 Dark Accent 3" w:uiPriority="50"/>
+    <w:lsdException w:name="Grid Table 6 Colorful Accent 3" w:uiPriority="51"/>
+    <w:lsdException w:name="Grid Table 7 Colorful Accent 3" w:uiPriority="52"/>
+    <w:lsdException w:name="Grid Table 1 Light Accent 4" w:uiPriority="46"/>
+    <w:lsdException w:name="Grid Table 2 Accent 4" w:uiPriority="47"/>
+    <w:lsdException w:name="Grid Table 3 Accent 4" w:uiPriority="48"/>
+    <w:lsdException w:name="Grid Table 4 Accent 4" w:uiPriority="49"/>
+    <w:lsdException w:name="Grid Table 5 Dark Accent 4" w:uiPriority="50"/>
+    <w:lsdException w:name="Grid Table 6 Colorful Accent 4" w:uiPriority="51"/>
+    <w:lsdException w:name="Grid Table 7 Colorful Accent 4" w:uiPriority="52"/>
+    <w:lsdException w:name="Grid Table 1 Light Accent 5" w:uiPriority="46"/>
+    <w:lsdException w:name="Grid Table 2 Accent 5" w:uiPriority="47"/>
+    <w:lsdException w:name="Grid Table 3 Accent 5" w:uiPriority="48"/>
+    <w:lsdException w:name="Grid Table 4 Accent 5" w:uiPriority="49"/>
+    <w:lsdException w:name="Grid Table 5 Dark Accent 5" w:uiPriority="50"/>
+    <w:lsdException w:name="Grid Table 6 Colorful Accent 5" w:uiPriority="51"/>
+    <w:lsdException w:name="Grid Table 7 Colorful Accent 5" w:uiPriority="52"/>
+    <w:lsdException w:name="Grid Table 1 Light Accent 6" w:uiPriority="46"/>
+    <w:lsdException w:name="Grid Table 2 Accent 6" w:uiPriority="47"/>
+    <w:lsdException w:name="Grid Table 3 Accent 6" w:uiPriority="48"/>
+    <w:lsdException w:name="Grid Table 4 Accent 6" w:uiPriority="49"/>
+    <w:lsdException w:name="Grid Table 5 Dark Accent 6" w:uiPriority="50"/>
+    <w:lsdException w:name="Grid Table 6 Colorful Accent 6" w:uiPriority="51"/>
+    <w:lsdException w:name="Grid Table 7 Colorful Accent 6" w:uiPriority="52"/>
+    <w:lsdException w:name="List Table 1 Light" w:uiPriority="46"/>
+    <w:lsdException w:name="List Table 2" w:uiPriority="47"/>
+    <w:lsdException w:name="List Table 3" w:uiPriority="48"/>
+    <w:lsdException w:name="List Table 4" w:uiPriority="49"/>
+    <w:lsdException w:name="List Table 5 Dark" w:uiPriority="50"/>
+    <w:lsdException w:name="List Table 6 Colorful" w:uiPriority="51"/>
+    <w:lsdException w:name="List Table 7 Colorful" w:uiPriority="52"/>
+    <w:lsdException w:name="List Table 1 Light Accent 1" w:uiPriority="46"/>
+    <w:lsdException w:name="List Table 2 Accent 1" w:uiPriority="47"/>
+    <w:lsdException w:name="List Table 3 Accent 1" w:uiPriority="48"/>
+    <w:lsdException w:name="List Table 4 Accent 1" w:uiPriority="49"/>
+    <w:lsdException w:name="List Table 5 Dark Accent 1" w:uiPriority="50"/>
+    <w:lsdException w:name="List Table 6 Colorful Accent 1" w:uiPriority="51"/>
+    <w:lsdException w:name="List Table 7 Colorful Accent 1" w:uiPriority="52"/>
+    <w:lsdException w:name="List Table 1 Light Accent 2" w:uiPriority="46"/>
+    <w:lsdException w:name="List Table 2 Accent 2" w:uiPriority="47"/>
+    <w:lsdException w:name="List Table 3 Accent 2" w:uiPriority="48"/>
+    <w:lsdException w:name="List Table 4 Accent 2" w:uiPriority="49"/>
+    <w:lsdException w:name="List Table 5 Dark Accent 2" w:uiPriority="50"/>
+    <w:lsdException w:name="List Table 6 Colorful Accent 2" w:uiPriority="51"/>
+    <w:lsdException w:name="List Table 7 Colorful Accent 2" w:uiPriority="52"/>
+    <w:lsdException w:name="List Table 1 Light Accent 3" w:uiPriority="46"/>
+    <w:lsdException w:name="List Table 2 Accent 3" w:uiPriority="47"/>
+    <w:lsdException w:name="List Table 3 Accent 3" w:uiPriority="48"/>
+    <w:lsdException w:name="List Table 4 Accent 3" w:uiPriority="49"/>
+    <w:lsdException w:name="List Table 5 Dark Accent 3" w:uiPriority="50"/>
+    <w:lsdException w:name="List Table 6 Colorful Accent 3" w:uiPriority="51"/>
+    <w:lsdException w:name="List Table 7 Colorful Accent 3" w:uiPriority="52"/>
+    <w:lsdException w:name="List Table 1 Light Accent 4" w:uiPriority="46"/>
+    <w:lsdException w:name="List Table 2 Accent 4" w:uiPriority="47"/>
+    <w:lsdException w:name="List Table 3 Accent 4" w:uiPriority="48"/>
+    <w:lsdException w:name="List Table 4 Accent 4" w:uiPriority="49"/>
+    <w:lsdException w:name="List Table 5 Dark Accent 4" w:uiPriority="50"/>
+    <w:lsdException w:name="List Table 6 Colorful Accent 4" w:uiPriority="51"/>
+    <w:lsdException w:name="List Table 7 Colorful Accent 4" w:uiPriority="52"/>
+    <w:lsdException w:name="List Table 1 Light Accent 5" w:uiPriority="46"/>
+    <w:lsdException w:name="List Table 2 Accent 5" w:uiPriority="47"/>
+    <w:lsdException w:name="List Table 3 Accent 5" w:uiPriority="48"/>
+    <w:lsdException w:name="List Table 4 Accent 5" w:uiPriority="49"/>
+    <w:lsdException w:name="List Table 5 Dark Accent 5" w:uiPriority="50"/>
+    <w:lsdException w:name="List Table 6 Colorful Accent 5" w:uiPriority="51"/>
+    <w:lsdException w:name="List Table 7 Colorful Accent 5" w:uiPriority="52"/>
+    <w:lsdException w:name="List Table 1 Light Accent 6" w:uiPriority="46"/>
+    <w:lsdException w:name="List Table 2 Accent 6" w:uiPriority="47"/>
+    <w:lsdException w:name="List Table 3 Accent 6" w:uiPriority="48"/>
+    <w:lsdException w:name="List Table 4 Accent 6" w:uiPriority="49"/>
+    <w:lsdException w:name="List Table 5 Dark Accent 6" w:uiPriority="50"/>
+    <w:lsdException w:name="List Table 6 Colorful Accent 6" w:uiPriority="51"/>
+    <w:lsdException w:name="List Table 7 Colorful Accent 6" w:uiPriority="52"/>
+    <w:lsdException w:name="Mention" w:semiHidden="1" w:uiPriority="99" w:unhideWhenUsed="1"/>
+    <w:lsdException w:name="Smart Hyperlink" w:semiHidden="1" w:uiPriority="99" w:unhideWhenUsed="1"/>
+    <w:lsdException w:name="Hashtag" w:semiHidden="1" w:uiPriority="99" w:unhideWhenUsed="1"/>
+    <w:lsdException w:name="Unresolved Mention" w:semiHidden="1" w:uiPriority="99" w:unhideWhenUsed="1"/>
+    <w:lsdException w:name="Smart Link" w:semiHidden="1" w:uiPriority="99" w:unhideWhenUsed="1"/>
+  </w:latentStyles>
+  <w:style w:type="paragraph" w:default="1" w:styleId="Normal">
     <w:name w:val="Normal"/>
     <w:qFormat/>
   </w:style>
-  <w:style w:styleId="BodyText" w:type="paragraph">
-    <w:name w:val="Body Text"/>
-    <w:basedOn w:val="Normal"/>
-    <w:link w:val="BodyTextChar"/>
-    <w:qFormat/>
-    <w:pPr>
-      <w:spacing w:after="180" w:before="180"/>
-    </w:pPr>
-  </w:style>
-  <w:style w:customStyle="1" w:styleId="FirstParagraph" w:type="paragraph">
-    <w:name w:val="First Paragraph"/>
-    <w:basedOn w:val="BodyText"/>
-    <w:next w:val="BodyText"/>
-    <w:qFormat/>
-  </w:style>
-  <w:style w:customStyle="1" w:styleId="Compact" w:type="paragraph">
-    <w:name w:val="Compact"/>
-    <w:basedOn w:val="BodyText"/>
-    <w:qFormat/>
-    <w:pPr>
-      <w:spacing w:after="36" w:before="36"/>
-    </w:pPr>
-  </w:style>
-  <w:style w:styleId="Title" w:type="paragraph">
-    <w:name w:val="Title"/>
-    <w:basedOn w:val="Normal"/>
-    <w:next w:val="BodyText"/>
-    <w:link w:val="TitleChar"/>
-    <w:uiPriority w:val="10"/>
-    <w:qFormat/>
-    <w:rsid w:val="00A10FD9"/>
-    <w:pPr>
-      <w:spacing w:after="80" w:line="240" w:lineRule="auto"/>
-      <w:contextualSpacing/>
-      <w:jc w:val="center"/>
-    </w:pPr>
-    <w:rPr>
-      <w:rFonts w:asciiTheme="majorHAnsi" w:cstheme="majorBidi" w:eastAsiaTheme="majorEastAsia" w:hAnsiTheme="majorHAnsi"/>
-      <w:sz w:val="56"/>
-      <w:szCs w:val="56"/>
-    </w:rPr>
-  </w:style>
-  <w:style w:customStyle="1" w:styleId="TitleChar" w:type="character">
-    <w:name w:val="Title Char"/>
-    <w:basedOn w:val="DefaultParagraphFont"/>
-    <w:link w:val="Title"/>
-    <w:uiPriority w:val="10"/>
-    <w:rsid w:val="00A10FD9"/>
-    <w:rPr>
-      <w:rFonts w:asciiTheme="majorHAnsi" w:cstheme="majorBidi" w:eastAsiaTheme="majorEastAsia" w:hAnsiTheme="majorHAnsi"/>
-      <w:sz w:val="56"/>
-      <w:szCs w:val="56"/>
-    </w:rPr>
-  </w:style>
-  <w:style w:styleId="Subtitle" w:type="paragraph">
-    <w:name w:val="Subtitle"/>
-    <w:basedOn w:val="Title"/>
-    <w:next w:val="BodyText"/>
-    <w:link w:val="SubtitleChar"/>
-    <w:uiPriority w:val="11"/>
-    <w:qFormat/>
-    <w:rsid w:val="00A10FD9"/>
-    <w:pPr>
-      <w:numPr>
-        <w:ilvl w:val="1"/>
-      </w:numPr>
-    </w:pPr>
-    <w:rPr>
-      <w:rFonts w:cstheme="majorBidi" w:eastAsiaTheme="majorEastAsia"/>
-      <w:spacing w:val="15"/>
-      <w:sz w:val="28"/>
-      <w:szCs w:val="28"/>
-    </w:rPr>
-  </w:style>
-  <w:style w:customStyle="1" w:styleId="SubtitleChar" w:type="character">
-    <w:name w:val="Subtitle Char"/>
-    <w:basedOn w:val="DefaultParagraphFont"/>
-    <w:link w:val="Subtitle"/>
-    <w:uiPriority w:val="11"/>
-    <w:rsid w:val="00A10FD9"/>
-    <w:rPr>
-      <w:rFonts w:cstheme="majorBidi" w:eastAsiaTheme="majorEastAsia"/>
-      <w:color w:themeColor="text1" w:themeTint="A6" w:val="595959"/>
-      <w:spacing w:val="15"/>
-      <w:sz w:val="28"/>
-      <w:szCs w:val="28"/>
-    </w:rPr>
-  </w:style>
-  <w:style w:customStyle="1" w:styleId="Author" w:type="paragraph">
-    <w:name w:val="Author"/>
-    <w:basedOn w:val="Title"/>
-    <w:next w:val="BodyText"/>
-    <w:qFormat/>
-    <w:pPr>
-      <w:keepNext/>
-      <w:keepLines/>
-    </w:pPr>
-    <w:rPr>
-      <w:sz w:val="24"/>
-      <w:szCs w:val="24"/>
-    </w:rPr>
-  </w:style>
-  <w:style w:styleId="Date" w:type="paragraph">
-    <w:name w:val="Date"/>
-    <w:basedOn w:val="Title"/>
-    <w:next w:val="BodyText"/>
-    <w:qFormat/>
-    <w:pPr>
-      <w:keepNext/>
-      <w:keepLines/>
-    </w:pPr>
-    <w:rPr>
-      <w:sz w:val="24"/>
-      <w:szCs w:val="24"/>
-    </w:rPr>
-  </w:style>
-  <w:style w:customStyle="1" w:styleId="AbstractTitle" w:type="paragraph">
-    <w:name w:val="Abstract Title"/>
-    <w:basedOn w:val="Normal"/>
-    <w:next w:val="Abstract"/>
-    <w:qFormat/>
-    <w:pPr>
-      <w:keepNext/>
-      <w:keepLines/>
-      <w:spacing w:after="0" w:before="300"/>
-      <w:jc w:val="center"/>
-    </w:pPr>
-    <w:rPr>
-      <w:b/>
-      <w:sz w:val="20"/>
-      <w:szCs w:val="20"/>
-    </w:rPr>
-  </w:style>
-  <w:style w:customStyle="1" w:styleId="Abstract" w:type="paragraph">
-    <w:name w:val="Abstract"/>
-    <w:basedOn w:val="Normal"/>
-    <w:next w:val="BodyText"/>
-    <w:qFormat/>
-    <w:pPr>
-      <w:keepNext/>
-      <w:keepLines/>
-      <w:spacing w:after="300" w:before="100"/>
-    </w:pPr>
-    <w:rPr>
-      <w:sz w:val="20"/>
-      <w:szCs w:val="20"/>
-    </w:rPr>
-  </w:style>
-  <w:style w:styleId="Bibliography" w:type="paragraph">
-    <w:name w:val="Bibliography"/>
-    <w:basedOn w:val="Normal"/>
-    <w:next w:val="Bibliography"/>
-    <w:qFormat/>
-    <w:pPr/>
-    <w:rPr/>
-  </w:style>
-  <w:style w:styleId="Heading1" w:type="paragraph">
+  <w:style w:type="paragraph" w:styleId="Ttulo1">
     <w:name w:val="heading 1"/>
     <w:basedOn w:val="Normal"/>
-    <w:next w:val="BodyText"/>
-    <w:link w:val="Heading1Char"/>
+    <w:next w:val="Corpodetexto"/>
+    <w:link w:val="Ttulo1Char"/>
     <w:uiPriority w:val="9"/>
     <w:qFormat/>
     <w:rsid w:val="00A10FD9"/>
     <w:pPr>
       <w:keepNext/>
       <w:keepLines/>
-      <w:spacing w:after="80" w:before="360"/>
+      <w:spacing w:before="360" w:after="80"/>
       <w:outlineLvl w:val="0"/>
     </w:pPr>
     <w:rPr>
-      <w:rFonts w:asciiTheme="majorHAnsi" w:cstheme="majorBidi" w:eastAsiaTheme="majorEastAsia" w:hAnsiTheme="majorHAnsi"/>
-      <w:color w:themeColor="accent1" w:themeShade="BF" w:val="0F4761"/>
+      <w:rFonts w:asciiTheme="majorHAnsi" w:eastAsiaTheme="majorEastAsia" w:hAnsiTheme="majorHAnsi" w:cstheme="majorBidi"/>
+      <w:color w:val="0F4761" w:themeColor="accent1" w:themeShade="BF"/>
       <w:sz w:val="40"/>
       <w:szCs w:val="40"/>
     </w:rPr>
   </w:style>
-  <w:style w:styleId="Heading2" w:type="paragraph">
+  <w:style w:type="paragraph" w:styleId="Ttulo2">
     <w:name w:val="heading 2"/>
     <w:basedOn w:val="Normal"/>
-    <w:next w:val="BodyText"/>
-    <w:link w:val="Heading2Char"/>
+    <w:next w:val="Corpodetexto"/>
+    <w:link w:val="Ttulo2Char"/>
     <w:uiPriority w:val="9"/>
     <w:semiHidden/>
     <w:unhideWhenUsed/>
@@ -1302,21 +1402,21 @@
     <w:pPr>
       <w:keepNext/>
       <w:keepLines/>
-      <w:spacing w:after="80" w:before="160"/>
+      <w:spacing w:before="160" w:after="80"/>
       <w:outlineLvl w:val="1"/>
     </w:pPr>
     <w:rPr>
-      <w:rFonts w:asciiTheme="majorHAnsi" w:cstheme="majorBidi" w:eastAsiaTheme="majorEastAsia" w:hAnsiTheme="majorHAnsi"/>
-      <w:color w:themeColor="accent1" w:themeShade="BF" w:val="0F4761"/>
+      <w:rFonts w:asciiTheme="majorHAnsi" w:eastAsiaTheme="majorEastAsia" w:hAnsiTheme="majorHAnsi" w:cstheme="majorBidi"/>
+      <w:color w:val="0F4761" w:themeColor="accent1" w:themeShade="BF"/>
       <w:sz w:val="32"/>
       <w:szCs w:val="32"/>
     </w:rPr>
   </w:style>
-  <w:style w:styleId="Heading3" w:type="paragraph">
+  <w:style w:type="paragraph" w:styleId="Ttulo3">
     <w:name w:val="heading 3"/>
     <w:basedOn w:val="Normal"/>
-    <w:next w:val="BodyText"/>
-    <w:link w:val="Heading3Char"/>
+    <w:next w:val="Corpodetexto"/>
+    <w:link w:val="Ttulo3Char"/>
     <w:uiPriority w:val="9"/>
     <w:semiHidden/>
     <w:unhideWhenUsed/>
@@ -1325,21 +1425,21 @@
     <w:pPr>
       <w:keepNext/>
       <w:keepLines/>
-      <w:spacing w:after="80" w:before="160"/>
+      <w:spacing w:before="160" w:after="80"/>
       <w:outlineLvl w:val="2"/>
     </w:pPr>
     <w:rPr>
-      <w:rFonts w:cstheme="majorBidi" w:eastAsiaTheme="majorEastAsia"/>
-      <w:color w:themeColor="accent1" w:themeShade="BF" w:val="0F4761"/>
+      <w:rFonts w:eastAsiaTheme="majorEastAsia" w:cstheme="majorBidi"/>
+      <w:color w:val="0F4761" w:themeColor="accent1" w:themeShade="BF"/>
       <w:sz w:val="28"/>
       <w:szCs w:val="28"/>
     </w:rPr>
   </w:style>
-  <w:style w:styleId="Heading4" w:type="paragraph">
+  <w:style w:type="paragraph" w:styleId="Ttulo4">
     <w:name w:val="heading 4"/>
     <w:basedOn w:val="Normal"/>
-    <w:next w:val="BodyText"/>
-    <w:link w:val="Heading4Char"/>
+    <w:next w:val="Corpodetexto"/>
+    <w:link w:val="Ttulo4Char"/>
     <w:uiPriority w:val="9"/>
     <w:semiHidden/>
     <w:unhideWhenUsed/>
@@ -1348,21 +1448,21 @@
     <w:pPr>
       <w:keepNext/>
       <w:keepLines/>
-      <w:spacing w:after="40" w:before="80"/>
+      <w:spacing w:before="80" w:after="40"/>
       <w:outlineLvl w:val="3"/>
     </w:pPr>
     <w:rPr>
-      <w:rFonts w:cstheme="majorBidi" w:eastAsiaTheme="majorEastAsia"/>
+      <w:rFonts w:eastAsiaTheme="majorEastAsia" w:cstheme="majorBidi"/>
       <w:i/>
       <w:iCs/>
-      <w:color w:themeColor="accent1" w:themeShade="BF" w:val="0F4761"/>
-    </w:rPr>
-  </w:style>
-  <w:style w:styleId="Heading5" w:type="paragraph">
+      <w:color w:val="0F4761" w:themeColor="accent1" w:themeShade="BF"/>
+    </w:rPr>
+  </w:style>
+  <w:style w:type="paragraph" w:styleId="Ttulo5">
     <w:name w:val="heading 5"/>
     <w:basedOn w:val="Normal"/>
-    <w:next w:val="BodyText"/>
-    <w:link w:val="Heading5Char"/>
+    <w:next w:val="Corpodetexto"/>
+    <w:link w:val="Ttulo5Char"/>
     <w:uiPriority w:val="9"/>
     <w:semiHidden/>
     <w:unhideWhenUsed/>
@@ -1371,19 +1471,19 @@
     <w:pPr>
       <w:keepNext/>
       <w:keepLines/>
-      <w:spacing w:after="40" w:before="80"/>
+      <w:spacing w:before="80" w:after="40"/>
       <w:outlineLvl w:val="4"/>
     </w:pPr>
     <w:rPr>
-      <w:rFonts w:cstheme="majorBidi" w:eastAsiaTheme="majorEastAsia"/>
-      <w:color w:themeColor="accent1" w:themeShade="BF" w:val="0F4761"/>
-    </w:rPr>
-  </w:style>
-  <w:style w:styleId="Heading6" w:type="paragraph">
+      <w:rFonts w:eastAsiaTheme="majorEastAsia" w:cstheme="majorBidi"/>
+      <w:color w:val="0F4761" w:themeColor="accent1" w:themeShade="BF"/>
+    </w:rPr>
+  </w:style>
+  <w:style w:type="paragraph" w:styleId="Ttulo6">
     <w:name w:val="heading 6"/>
     <w:basedOn w:val="Normal"/>
-    <w:next w:val="BodyText"/>
-    <w:link w:val="Heading6Char"/>
+    <w:next w:val="Corpodetexto"/>
+    <w:link w:val="Ttulo6Char"/>
     <w:uiPriority w:val="9"/>
     <w:semiHidden/>
     <w:unhideWhenUsed/>
@@ -1392,21 +1492,21 @@
     <w:pPr>
       <w:keepNext/>
       <w:keepLines/>
-      <w:spacing w:after="0" w:before="40"/>
+      <w:spacing w:before="40" w:after="0"/>
       <w:outlineLvl w:val="5"/>
     </w:pPr>
     <w:rPr>
-      <w:rFonts w:cstheme="majorBidi" w:eastAsiaTheme="majorEastAsia"/>
+      <w:rFonts w:eastAsiaTheme="majorEastAsia" w:cstheme="majorBidi"/>
       <w:i/>
       <w:iCs/>
-      <w:color w:themeColor="text1" w:themeTint="A6" w:val="595959"/>
-    </w:rPr>
-  </w:style>
-  <w:style w:styleId="Heading7" w:type="paragraph">
+      <w:color w:val="595959" w:themeColor="text1" w:themeTint="A6"/>
+    </w:rPr>
+  </w:style>
+  <w:style w:type="paragraph" w:styleId="Ttulo7">
     <w:name w:val="heading 7"/>
     <w:basedOn w:val="Normal"/>
-    <w:next w:val="BodyText"/>
-    <w:link w:val="Heading7Char"/>
+    <w:next w:val="Corpodetexto"/>
+    <w:link w:val="Ttulo7Char"/>
     <w:uiPriority w:val="9"/>
     <w:semiHidden/>
     <w:unhideWhenUsed/>
@@ -1415,19 +1515,19 @@
     <w:pPr>
       <w:keepNext/>
       <w:keepLines/>
-      <w:spacing w:after="0" w:before="40"/>
+      <w:spacing w:before="40" w:after="0"/>
       <w:outlineLvl w:val="6"/>
     </w:pPr>
     <w:rPr>
-      <w:rFonts w:cstheme="majorBidi" w:eastAsiaTheme="majorEastAsia"/>
-      <w:color w:themeColor="text1" w:themeTint="A6" w:val="595959"/>
-    </w:rPr>
-  </w:style>
-  <w:style w:styleId="Heading8" w:type="paragraph">
+      <w:rFonts w:eastAsiaTheme="majorEastAsia" w:cstheme="majorBidi"/>
+      <w:color w:val="595959" w:themeColor="text1" w:themeTint="A6"/>
+    </w:rPr>
+  </w:style>
+  <w:style w:type="paragraph" w:styleId="Ttulo8">
     <w:name w:val="heading 8"/>
     <w:basedOn w:val="Normal"/>
-    <w:next w:val="BodyText"/>
-    <w:link w:val="Heading8Char"/>
+    <w:next w:val="Corpodetexto"/>
+    <w:link w:val="Ttulo8Char"/>
     <w:uiPriority w:val="9"/>
     <w:semiHidden/>
     <w:unhideWhenUsed/>
@@ -1440,17 +1540,17 @@
       <w:outlineLvl w:val="7"/>
     </w:pPr>
     <w:rPr>
-      <w:rFonts w:cstheme="majorBidi" w:eastAsiaTheme="majorEastAsia"/>
+      <w:rFonts w:eastAsiaTheme="majorEastAsia" w:cstheme="majorBidi"/>
       <w:i/>
       <w:iCs/>
-      <w:color w:themeColor="text1" w:themeTint="D8" w:val="272727"/>
-    </w:rPr>
-  </w:style>
-  <w:style w:styleId="Heading9" w:type="paragraph">
+      <w:color w:val="272727" w:themeColor="text1" w:themeTint="D8"/>
+    </w:rPr>
+  </w:style>
+  <w:style w:type="paragraph" w:styleId="Ttulo9">
     <w:name w:val="heading 9"/>
     <w:basedOn w:val="Normal"/>
-    <w:next w:val="BodyText"/>
-    <w:link w:val="Heading9Char"/>
+    <w:next w:val="Corpodetexto"/>
+    <w:link w:val="Ttulo9Char"/>
     <w:uiPriority w:val="9"/>
     <w:semiHidden/>
     <w:unhideWhenUsed/>
@@ -1463,198 +1563,368 @@
       <w:outlineLvl w:val="8"/>
     </w:pPr>
     <w:rPr>
-      <w:rFonts w:cstheme="majorBidi" w:eastAsiaTheme="majorEastAsia"/>
-      <w:color w:themeColor="text1" w:themeTint="D8" w:val="272727"/>
-    </w:rPr>
-  </w:style>
-  <w:style w:customStyle="1" w:styleId="Heading1Char" w:type="character">
-    <w:name w:val="Heading 1 Char"/>
-    <w:basedOn w:val="DefaultParagraphFont"/>
-    <w:link w:val="Heading1"/>
+      <w:rFonts w:eastAsiaTheme="majorEastAsia" w:cstheme="majorBidi"/>
+      <w:color w:val="272727" w:themeColor="text1" w:themeTint="D8"/>
+    </w:rPr>
+  </w:style>
+  <w:style w:type="character" w:default="1" w:styleId="Fontepargpadro">
+    <w:name w:val="Default Paragraph Font"/>
+    <w:uiPriority w:val="1"/>
+    <w:semiHidden/>
+    <w:unhideWhenUsed/>
+  </w:style>
+  <w:style w:type="table" w:default="1" w:styleId="Tabelanormal">
+    <w:name w:val="Normal Table"/>
+    <w:uiPriority w:val="99"/>
+    <w:semiHidden/>
+    <w:unhideWhenUsed/>
+    <w:tblPr>
+      <w:tblInd w:w="0" w:type="dxa"/>
+      <w:tblCellMar>
+        <w:top w:w="0" w:type="dxa"/>
+        <w:left w:w="108" w:type="dxa"/>
+        <w:bottom w:w="0" w:type="dxa"/>
+        <w:right w:w="108" w:type="dxa"/>
+      </w:tblCellMar>
+    </w:tblPr>
+  </w:style>
+  <w:style w:type="numbering" w:default="1" w:styleId="Semlista">
+    <w:name w:val="No List"/>
+    <w:uiPriority w:val="99"/>
+    <w:semiHidden/>
+    <w:unhideWhenUsed/>
+  </w:style>
+  <w:style w:type="paragraph" w:styleId="Corpodetexto">
+    <w:name w:val="Body Text"/>
+    <w:basedOn w:val="Normal"/>
+    <w:qFormat/>
+    <w:pPr>
+      <w:spacing w:before="180" w:after="180"/>
+    </w:pPr>
+  </w:style>
+  <w:style w:type="paragraph" w:customStyle="1" w:styleId="FirstParagraph">
+    <w:name w:val="First Paragraph"/>
+    <w:basedOn w:val="Corpodetexto"/>
+    <w:next w:val="Corpodetexto"/>
+    <w:qFormat/>
+  </w:style>
+  <w:style w:type="paragraph" w:customStyle="1" w:styleId="Compact">
+    <w:name w:val="Compact"/>
+    <w:basedOn w:val="Corpodetexto"/>
+    <w:qFormat/>
+    <w:pPr>
+      <w:spacing w:before="36" w:after="36"/>
+    </w:pPr>
+  </w:style>
+  <w:style w:type="paragraph" w:styleId="Ttulo">
+    <w:name w:val="Title"/>
+    <w:basedOn w:val="Normal"/>
+    <w:next w:val="Corpodetexto"/>
+    <w:link w:val="TtuloChar"/>
+    <w:uiPriority w:val="10"/>
+    <w:qFormat/>
+    <w:rsid w:val="00A10FD9"/>
+    <w:pPr>
+      <w:spacing w:after="80"/>
+      <w:contextualSpacing/>
+      <w:jc w:val="center"/>
+    </w:pPr>
+    <w:rPr>
+      <w:rFonts w:asciiTheme="majorHAnsi" w:eastAsiaTheme="majorEastAsia" w:hAnsiTheme="majorHAnsi" w:cstheme="majorBidi"/>
+      <w:sz w:val="56"/>
+      <w:szCs w:val="56"/>
+    </w:rPr>
+  </w:style>
+  <w:style w:type="character" w:customStyle="1" w:styleId="TtuloChar">
+    <w:name w:val="Título Char"/>
+    <w:basedOn w:val="Fontepargpadro"/>
+    <w:link w:val="Ttulo"/>
+    <w:uiPriority w:val="10"/>
+    <w:rsid w:val="00A10FD9"/>
+    <w:rPr>
+      <w:rFonts w:asciiTheme="majorHAnsi" w:eastAsiaTheme="majorEastAsia" w:hAnsiTheme="majorHAnsi" w:cstheme="majorBidi"/>
+      <w:sz w:val="56"/>
+      <w:szCs w:val="56"/>
+    </w:rPr>
+  </w:style>
+  <w:style w:type="paragraph" w:styleId="Subttulo">
+    <w:name w:val="Subtitle"/>
+    <w:basedOn w:val="Ttulo"/>
+    <w:next w:val="Corpodetexto"/>
+    <w:link w:val="SubttuloChar"/>
+    <w:uiPriority w:val="11"/>
+    <w:qFormat/>
+    <w:rsid w:val="00A10FD9"/>
+    <w:pPr>
+      <w:numPr>
+        <w:ilvl w:val="1"/>
+      </w:numPr>
+    </w:pPr>
+    <w:rPr>
+      <w:spacing w:val="15"/>
+      <w:sz w:val="28"/>
+      <w:szCs w:val="28"/>
+    </w:rPr>
+  </w:style>
+  <w:style w:type="character" w:customStyle="1" w:styleId="SubttuloChar">
+    <w:name w:val="Subtítulo Char"/>
+    <w:basedOn w:val="Fontepargpadro"/>
+    <w:link w:val="Subttulo"/>
+    <w:uiPriority w:val="11"/>
+    <w:rsid w:val="00A10FD9"/>
+    <w:rPr>
+      <w:rFonts w:eastAsiaTheme="majorEastAsia" w:cstheme="majorBidi"/>
+      <w:color w:val="595959" w:themeColor="text1" w:themeTint="A6"/>
+      <w:spacing w:val="15"/>
+      <w:sz w:val="28"/>
+      <w:szCs w:val="28"/>
+    </w:rPr>
+  </w:style>
+  <w:style w:type="paragraph" w:customStyle="1" w:styleId="Author">
+    <w:name w:val="Author"/>
+    <w:basedOn w:val="Ttulo"/>
+    <w:next w:val="Corpodetexto"/>
+    <w:qFormat/>
+    <w:pPr>
+      <w:keepNext/>
+      <w:keepLines/>
+    </w:pPr>
+    <w:rPr>
+      <w:sz w:val="24"/>
+      <w:szCs w:val="24"/>
+    </w:rPr>
+  </w:style>
+  <w:style w:type="paragraph" w:styleId="Data">
+    <w:name w:val="Date"/>
+    <w:basedOn w:val="Ttulo"/>
+    <w:next w:val="Corpodetexto"/>
+    <w:qFormat/>
+    <w:pPr>
+      <w:keepNext/>
+      <w:keepLines/>
+    </w:pPr>
+    <w:rPr>
+      <w:sz w:val="24"/>
+      <w:szCs w:val="24"/>
+    </w:rPr>
+  </w:style>
+  <w:style w:type="paragraph" w:customStyle="1" w:styleId="AbstractTitle">
+    <w:name w:val="Abstract Title"/>
+    <w:basedOn w:val="Normal"/>
+    <w:next w:val="Abstract"/>
+    <w:qFormat/>
+    <w:pPr>
+      <w:keepNext/>
+      <w:keepLines/>
+      <w:spacing w:before="300" w:after="0"/>
+      <w:jc w:val="center"/>
+    </w:pPr>
+    <w:rPr>
+      <w:b/>
+      <w:sz w:val="20"/>
+      <w:szCs w:val="20"/>
+    </w:rPr>
+  </w:style>
+  <w:style w:type="paragraph" w:customStyle="1" w:styleId="Abstract">
+    <w:name w:val="Abstract"/>
+    <w:basedOn w:val="Normal"/>
+    <w:next w:val="Corpodetexto"/>
+    <w:qFormat/>
+    <w:pPr>
+      <w:keepNext/>
+      <w:keepLines/>
+      <w:spacing w:before="100" w:after="300"/>
+    </w:pPr>
+    <w:rPr>
+      <w:sz w:val="20"/>
+      <w:szCs w:val="20"/>
+    </w:rPr>
+  </w:style>
+  <w:style w:type="paragraph" w:styleId="Bibliografia">
+    <w:name w:val="Bibliography"/>
+    <w:basedOn w:val="Normal"/>
+    <w:qFormat/>
+  </w:style>
+  <w:style w:type="character" w:customStyle="1" w:styleId="Ttulo1Char">
+    <w:name w:val="Título 1 Char"/>
+    <w:basedOn w:val="Fontepargpadro"/>
+    <w:link w:val="Ttulo1"/>
     <w:uiPriority w:val="9"/>
     <w:rsid w:val="00A10FD9"/>
     <w:rPr>
-      <w:rFonts w:asciiTheme="majorHAnsi" w:cstheme="majorBidi" w:eastAsiaTheme="majorEastAsia" w:hAnsiTheme="majorHAnsi"/>
-      <w:color w:themeColor="accent1" w:themeShade="BF" w:val="0F4761"/>
+      <w:rFonts w:asciiTheme="majorHAnsi" w:eastAsiaTheme="majorEastAsia" w:hAnsiTheme="majorHAnsi" w:cstheme="majorBidi"/>
+      <w:color w:val="0F4761" w:themeColor="accent1" w:themeShade="BF"/>
       <w:sz w:val="40"/>
       <w:szCs w:val="40"/>
     </w:rPr>
   </w:style>
-  <w:style w:customStyle="1" w:styleId="Heading2Char" w:type="character">
-    <w:name w:val="Heading 2 Char"/>
-    <w:basedOn w:val="DefaultParagraphFont"/>
-    <w:link w:val="Heading2"/>
+  <w:style w:type="character" w:customStyle="1" w:styleId="Ttulo2Char">
+    <w:name w:val="Título 2 Char"/>
+    <w:basedOn w:val="Fontepargpadro"/>
+    <w:link w:val="Ttulo2"/>
     <w:uiPriority w:val="9"/>
     <w:semiHidden/>
     <w:rsid w:val="00A10FD9"/>
     <w:rPr>
-      <w:rFonts w:asciiTheme="majorHAnsi" w:cstheme="majorBidi" w:eastAsiaTheme="majorEastAsia" w:hAnsiTheme="majorHAnsi"/>
-      <w:color w:themeColor="accent1" w:themeShade="BF" w:val="0F4761"/>
+      <w:rFonts w:asciiTheme="majorHAnsi" w:eastAsiaTheme="majorEastAsia" w:hAnsiTheme="majorHAnsi" w:cstheme="majorBidi"/>
+      <w:color w:val="0F4761" w:themeColor="accent1" w:themeShade="BF"/>
       <w:sz w:val="32"/>
       <w:szCs w:val="32"/>
     </w:rPr>
   </w:style>
-  <w:style w:customStyle="1" w:styleId="Heading3Char" w:type="character">
-    <w:name w:val="Heading 3 Char"/>
-    <w:basedOn w:val="DefaultParagraphFont"/>
-    <w:link w:val="Heading3"/>
+  <w:style w:type="character" w:customStyle="1" w:styleId="Ttulo3Char">
+    <w:name w:val="Título 3 Char"/>
+    <w:basedOn w:val="Fontepargpadro"/>
+    <w:link w:val="Ttulo3"/>
     <w:uiPriority w:val="9"/>
     <w:semiHidden/>
     <w:rsid w:val="00A10FD9"/>
     <w:rPr>
-      <w:rFonts w:cstheme="majorBidi" w:eastAsiaTheme="majorEastAsia"/>
-      <w:color w:themeColor="accent1" w:themeShade="BF" w:val="0F4761"/>
+      <w:rFonts w:eastAsiaTheme="majorEastAsia" w:cstheme="majorBidi"/>
+      <w:color w:val="0F4761" w:themeColor="accent1" w:themeShade="BF"/>
       <w:sz w:val="28"/>
       <w:szCs w:val="28"/>
     </w:rPr>
   </w:style>
-  <w:style w:customStyle="1" w:styleId="Heading4Char" w:type="character">
-    <w:name w:val="Heading 4 Char"/>
-    <w:basedOn w:val="DefaultParagraphFont"/>
-    <w:link w:val="Heading4"/>
+  <w:style w:type="character" w:customStyle="1" w:styleId="Ttulo4Char">
+    <w:name w:val="Título 4 Char"/>
+    <w:basedOn w:val="Fontepargpadro"/>
+    <w:link w:val="Ttulo4"/>
     <w:uiPriority w:val="9"/>
     <w:semiHidden/>
     <w:rsid w:val="00A10FD9"/>
     <w:rPr>
-      <w:rFonts w:cstheme="majorBidi" w:eastAsiaTheme="majorEastAsia"/>
+      <w:rFonts w:eastAsiaTheme="majorEastAsia" w:cstheme="majorBidi"/>
       <w:i/>
       <w:iCs/>
-      <w:color w:themeColor="accent1" w:themeShade="BF" w:val="0F4761"/>
-    </w:rPr>
-  </w:style>
-  <w:style w:customStyle="1" w:styleId="Heading5Char" w:type="character">
-    <w:name w:val="Heading 5 Char"/>
-    <w:basedOn w:val="DefaultParagraphFont"/>
-    <w:link w:val="Heading5"/>
+      <w:color w:val="0F4761" w:themeColor="accent1" w:themeShade="BF"/>
+    </w:rPr>
+  </w:style>
+  <w:style w:type="character" w:customStyle="1" w:styleId="Ttulo5Char">
+    <w:name w:val="Título 5 Char"/>
+    <w:basedOn w:val="Fontepargpadro"/>
+    <w:link w:val="Ttulo5"/>
     <w:uiPriority w:val="9"/>
     <w:semiHidden/>
     <w:rsid w:val="00A10FD9"/>
     <w:rPr>
-      <w:rFonts w:cstheme="majorBidi" w:eastAsiaTheme="majorEastAsia"/>
-      <w:color w:themeColor="accent1" w:themeShade="BF" w:val="0F4761"/>
-    </w:rPr>
-  </w:style>
-  <w:style w:customStyle="1" w:styleId="Heading6Char" w:type="character">
-    <w:name w:val="Heading 6 Char"/>
-    <w:basedOn w:val="DefaultParagraphFont"/>
-    <w:link w:val="Heading6"/>
+      <w:rFonts w:eastAsiaTheme="majorEastAsia" w:cstheme="majorBidi"/>
+      <w:color w:val="0F4761" w:themeColor="accent1" w:themeShade="BF"/>
+    </w:rPr>
+  </w:style>
+  <w:style w:type="character" w:customStyle="1" w:styleId="Ttulo6Char">
+    <w:name w:val="Título 6 Char"/>
+    <w:basedOn w:val="Fontepargpadro"/>
+    <w:link w:val="Ttulo6"/>
     <w:uiPriority w:val="9"/>
     <w:semiHidden/>
     <w:rsid w:val="00A10FD9"/>
     <w:rPr>
-      <w:rFonts w:cstheme="majorBidi" w:eastAsiaTheme="majorEastAsia"/>
+      <w:rFonts w:eastAsiaTheme="majorEastAsia" w:cstheme="majorBidi"/>
       <w:i/>
       <w:iCs/>
-      <w:color w:themeColor="text1" w:themeTint="A6" w:val="595959"/>
-    </w:rPr>
-  </w:style>
-  <w:style w:customStyle="1" w:styleId="Heading7Char" w:type="character">
-    <w:name w:val="Heading 7 Char"/>
-    <w:basedOn w:val="DefaultParagraphFont"/>
-    <w:link w:val="Heading7"/>
+      <w:color w:val="595959" w:themeColor="text1" w:themeTint="A6"/>
+    </w:rPr>
+  </w:style>
+  <w:style w:type="character" w:customStyle="1" w:styleId="Ttulo7Char">
+    <w:name w:val="Título 7 Char"/>
+    <w:basedOn w:val="Fontepargpadro"/>
+    <w:link w:val="Ttulo7"/>
     <w:uiPriority w:val="9"/>
     <w:semiHidden/>
     <w:rsid w:val="00A10FD9"/>
     <w:rPr>
-      <w:rFonts w:cstheme="majorBidi" w:eastAsiaTheme="majorEastAsia"/>
-      <w:color w:themeColor="text1" w:themeTint="A6" w:val="595959"/>
-    </w:rPr>
-  </w:style>
-  <w:style w:customStyle="1" w:styleId="Heading8Char" w:type="character">
-    <w:name w:val="Heading 8 Char"/>
-    <w:basedOn w:val="DefaultParagraphFont"/>
-    <w:link w:val="Heading8"/>
+      <w:rFonts w:eastAsiaTheme="majorEastAsia" w:cstheme="majorBidi"/>
+      <w:color w:val="595959" w:themeColor="text1" w:themeTint="A6"/>
+    </w:rPr>
+  </w:style>
+  <w:style w:type="character" w:customStyle="1" w:styleId="Ttulo8Char">
+    <w:name w:val="Título 8 Char"/>
+    <w:basedOn w:val="Fontepargpadro"/>
+    <w:link w:val="Ttulo8"/>
     <w:uiPriority w:val="9"/>
     <w:semiHidden/>
     <w:rsid w:val="00A10FD9"/>
     <w:rPr>
-      <w:rFonts w:cstheme="majorBidi" w:eastAsiaTheme="majorEastAsia"/>
+      <w:rFonts w:eastAsiaTheme="majorEastAsia" w:cstheme="majorBidi"/>
       <w:i/>
       <w:iCs/>
-      <w:color w:themeColor="text1" w:themeTint="D8" w:val="272727"/>
-    </w:rPr>
-  </w:style>
-  <w:style w:customStyle="1" w:styleId="Heading9Char" w:type="character">
-    <w:name w:val="Heading 9 Char"/>
-    <w:basedOn w:val="DefaultParagraphFont"/>
-    <w:link w:val="Heading9"/>
+      <w:color w:val="272727" w:themeColor="text1" w:themeTint="D8"/>
+    </w:rPr>
+  </w:style>
+  <w:style w:type="character" w:customStyle="1" w:styleId="Ttulo9Char">
+    <w:name w:val="Título 9 Char"/>
+    <w:basedOn w:val="Fontepargpadro"/>
+    <w:link w:val="Ttulo9"/>
     <w:uiPriority w:val="9"/>
     <w:semiHidden/>
     <w:rsid w:val="00A10FD9"/>
     <w:rPr>
-      <w:rFonts w:cstheme="majorBidi" w:eastAsiaTheme="majorEastAsia"/>
-      <w:color w:themeColor="text1" w:themeTint="D8" w:val="272727"/>
-    </w:rPr>
-  </w:style>
-  <w:style w:styleId="BlockText" w:type="paragraph">
+      <w:rFonts w:eastAsiaTheme="majorEastAsia" w:cstheme="majorBidi"/>
+      <w:color w:val="272727" w:themeColor="text1" w:themeTint="D8"/>
+    </w:rPr>
+  </w:style>
+  <w:style w:type="paragraph" w:styleId="Textoembloco">
     <w:name w:val="Block Text"/>
-    <w:basedOn w:val="BodyText"/>
-    <w:next w:val="BodyText"/>
+    <w:basedOn w:val="Corpodetexto"/>
+    <w:next w:val="Corpodetexto"/>
     <w:uiPriority w:val="9"/>
     <w:unhideWhenUsed/>
     <w:qFormat/>
     <w:pPr>
-      <w:spacing w:after="100" w:before="100"/>
-      <w:ind w:firstLine="0" w:left="480" w:right="480"/>
+      <w:spacing w:before="100" w:after="100"/>
+      <w:ind w:left="480" w:right="480"/>
     </w:pPr>
   </w:style>
-  <w:style w:styleId="FootnoteText" w:type="paragraph">
-    <w:name w:val="Footnote Text"/>
+  <w:style w:type="paragraph" w:styleId="Textodenotaderodap">
+    <w:name w:val="footnote text"/>
     <w:basedOn w:val="Normal"/>
-    <w:next w:val="FootnoteText"/>
     <w:uiPriority w:val="9"/>
     <w:unhideWhenUsed/>
     <w:qFormat/>
   </w:style>
-  <w:style w:styleId="FootnoteBlockText" w:type="paragraph">
+  <w:style w:type="paragraph" w:customStyle="1" w:styleId="FootnoteBlockText">
     <w:name w:val="Footnote Block Text"/>
-    <w:basedOn w:val="FootnoteText"/>
-    <w:next w:val="FootnoteText"/>
+    <w:basedOn w:val="Textodenotaderodap"/>
+    <w:next w:val="Textodenotaderodap"/>
     <w:uiPriority w:val="9"/>
     <w:unhideWhenUsed/>
     <w:qFormat/>
     <w:pPr>
-      <w:spacing w:after="100" w:before="100"/>
-      <w:ind w:firstLine="0" w:left="480" w:right="480"/>
+      <w:spacing w:before="100" w:after="100"/>
+      <w:ind w:left="480" w:right="480"/>
     </w:pPr>
   </w:style>
-  <w:style w:default="1" w:styleId="DefaultParagraphFont" w:type="character">
-    <w:name w:val="Default Paragraph Font"/>
-    <w:semiHidden/>
-    <w:unhideWhenUsed/>
-  </w:style>
-  <w:style w:default="1" w:styleId="Table" w:type="table">
+  <w:style w:type="table" w:customStyle="1" w:styleId="Table">
     <w:name w:val="Table"/>
-    <w:basedOn w:val="TableNormal"/>
     <w:semiHidden/>
     <w:unhideWhenUsed/>
     <w:qFormat/>
     <w:tblPr>
-      <w:tblInd w:type="dxa" w:w="0"/>
+      <w:tblInd w:w="0" w:type="dxa"/>
       <w:tblCellMar>
-        <w:top w:type="dxa" w:w="0"/>
-        <w:left w:type="dxa" w:w="108"/>
-        <w:bottom w:type="dxa" w:w="0"/>
-        <w:right w:type="dxa" w:w="108"/>
+        <w:top w:w="0" w:type="dxa"/>
+        <w:left w:w="108" w:type="dxa"/>
+        <w:bottom w:w="0" w:type="dxa"/>
+        <w:right w:w="108" w:type="dxa"/>
       </w:tblCellMar>
     </w:tblPr>
     <w:tblStylePr w:type="firstRow">
       <w:tblPr>
         <w:jc w:val="left"/>
-        <w:tblInd w:type="dxa" w:w="0"/>
       </w:tblPr>
       <w:trPr>
         <w:jc w:val="left"/>
       </w:trPr>
       <w:tcPr>
         <w:tcBorders>
-          <w:bottom w:val="single"/>
+          <w:bottom w:val="single" w:sz="0" w:space="0" w:color="auto"/>
         </w:tcBorders>
         <w:vAlign w:val="bottom"/>
       </w:tcPr>
     </w:tblStylePr>
   </w:style>
-  <w:style w:customStyle="1" w:styleId="DefinitionTerm" w:type="paragraph">
+  <w:style w:type="paragraph" w:customStyle="1" w:styleId="DefinitionTerm">
     <w:name w:val="Definition Term"/>
     <w:basedOn w:val="Normal"/>
     <w:next w:val="Definition"/>
@@ -1667,78 +1937,79 @@
       <w:b/>
     </w:rPr>
   </w:style>
-  <w:style w:customStyle="1" w:styleId="Definition" w:type="paragraph">
+  <w:style w:type="paragraph" w:customStyle="1" w:styleId="Definition">
     <w:name w:val="Definition"/>
     <w:basedOn w:val="Normal"/>
   </w:style>
-  <w:style w:styleId="Caption" w:type="paragraph">
-    <w:name w:val="Caption"/>
+  <w:style w:type="paragraph" w:styleId="Legenda">
+    <w:name w:val="caption"/>
     <w:basedOn w:val="Normal"/>
-    <w:link w:val="BodyTextChar"/>
+    <w:link w:val="LegendaChar"/>
     <w:pPr>
-      <w:spacing w:after="120" w:before="0"/>
+      <w:spacing w:after="120"/>
     </w:pPr>
     <w:rPr>
       <w:i/>
     </w:rPr>
   </w:style>
-  <w:style w:customStyle="1" w:styleId="TableCaption" w:type="paragraph">
+  <w:style w:type="paragraph" w:customStyle="1" w:styleId="TableCaption">
     <w:name w:val="Table Caption"/>
-    <w:basedOn w:val="Caption"/>
+    <w:basedOn w:val="Legenda"/>
     <w:pPr>
       <w:keepNext/>
     </w:pPr>
   </w:style>
-  <w:style w:customStyle="1" w:styleId="ImageCaption" w:type="paragraph">
+  <w:style w:type="paragraph" w:customStyle="1" w:styleId="ImageCaption">
     <w:name w:val="Image Caption"/>
-    <w:basedOn w:val="Caption"/>
-  </w:style>
-  <w:style w:customStyle="1" w:styleId="Figure" w:type="paragraph">
+    <w:basedOn w:val="Legenda"/>
+  </w:style>
+  <w:style w:type="paragraph" w:customStyle="1" w:styleId="Figure">
     <w:name w:val="Figure"/>
     <w:basedOn w:val="Normal"/>
   </w:style>
-  <w:style w:customStyle="1" w:styleId="CaptionedFigure" w:type="paragraph">
+  <w:style w:type="paragraph" w:customStyle="1" w:styleId="CaptionedFigure">
     <w:name w:val="Captioned Figure"/>
     <w:basedOn w:val="Figure"/>
     <w:pPr>
       <w:keepNext/>
     </w:pPr>
   </w:style>
-  <w:style w:customStyle="1" w:styleId="BodyTextChar" w:type="character">
-    <w:name w:val="Body Text Char"/>
-    <w:basedOn w:val="DefaultParagraphFont"/>
-    <w:link w:val="BodyText"/>
-  </w:style>
-  <w:style w:customStyle="1" w:styleId="VerbatimChar" w:type="character">
+  <w:style w:type="character" w:customStyle="1" w:styleId="LegendaChar">
+    <w:name w:val="Legenda Char"/>
+    <w:basedOn w:val="Fontepargpadro"/>
+    <w:link w:val="Legenda"/>
+  </w:style>
+  <w:style w:type="character" w:customStyle="1" w:styleId="VerbatimChar">
     <w:name w:val="Verbatim Char"/>
-    <w:basedOn w:val="BodyTextChar"/>
-    <w:rPr>
-      <w:rFonts w:ascii="Consolas" w:hAnsi="Consolas"/>
-      <w:sz w:val="22"/>
-    </w:rPr>
-  </w:style>
-  <w:style w:customStyle="1" w:styleId="SectionNumber" w:type="character">
+    <w:basedOn w:val="LegendaChar"/>
+    <w:link w:val="SourceCode"/>
+    <w:rPr>
+      <w:rFonts w:ascii="Consolas" w:hAnsi="Consolas"/>
+      <w:sz w:val="22"/>
+    </w:rPr>
+  </w:style>
+  <w:style w:type="character" w:customStyle="1" w:styleId="SectionNumber">
     <w:name w:val="Section Number"/>
-    <w:basedOn w:val="BodyTextChar"/>
-  </w:style>
-  <w:style w:styleId="FootnoteReference" w:type="character">
-    <w:name w:val="Footnote Reference"/>
-    <w:basedOn w:val="BodyTextChar"/>
+    <w:basedOn w:val="LegendaChar"/>
+  </w:style>
+  <w:style w:type="character" w:styleId="Refdenotaderodap">
+    <w:name w:val="footnote reference"/>
+    <w:basedOn w:val="LegendaChar"/>
     <w:rPr>
       <w:vertAlign w:val="superscript"/>
     </w:rPr>
   </w:style>
-  <w:style w:styleId="Hyperlink" w:type="character">
+  <w:style w:type="character" w:styleId="Hyperlink">
     <w:name w:val="Hyperlink"/>
-    <w:basedOn w:val="BodyTextChar"/>
-    <w:rPr>
-      <w:color w:themeColor="accent1" w:val="4F81BD"/>
-    </w:rPr>
-  </w:style>
-  <w:style w:styleId="TOCHeading" w:type="paragraph">
+    <w:basedOn w:val="LegendaChar"/>
+    <w:rPr>
+      <w:color w:val="156082" w:themeColor="accent1"/>
+    </w:rPr>
+  </w:style>
+  <w:style w:type="paragraph" w:styleId="CabealhodoSumrio">
     <w:name w:val="TOC Heading"/>
-    <w:basedOn w:val="Heading1"/>
-    <w:next w:val="BodyText"/>
+    <w:basedOn w:val="Ttulo1"/>
+    <w:next w:val="Corpodetexto"/>
     <w:uiPriority w:val="39"/>
     <w:unhideWhenUsed/>
     <w:qFormat/>
@@ -1746,273 +2017,329 @@
       <w:spacing w:before="240" w:line="259" w:lineRule="auto"/>
       <w:outlineLvl w:val="9"/>
     </w:pPr>
-    <w:rPr>
-      <w:rFonts w:asciiTheme="majorHAnsi" w:cstheme="majorBidi" w:eastAsiaTheme="majorEastAsia" w:hAnsiTheme="majorHAnsi"/>
-      <w:b w:val="0"/>
-      <w:bCs w:val="0"/>
-      <w:color w:themeColor="accent1" w:themeShade="BF" w:val="365F91"/>
-    </w:rPr>
   </w:style>
   <w:style w:type="paragraph" w:customStyle="1" w:styleId="SourceCode">
     <w:name w:val="Source Code"/>
     <w:basedOn w:val="Normal"/>
     <w:link w:val="VerbatimChar"/>
     <w:pPr>
-      <w:wordWrap w:val="off"/>
-      <w:shd w:val="clear" w:fill="f1f3f5"/>
+      <w:shd w:val="clear" w:color="auto" w:fill="F1F3F5"/>
+      <w:wordWrap w:val="0"/>
     </w:pPr>
   </w:style>
   <w:style w:type="character" w:customStyle="1" w:styleId="KeywordTok">
     <w:name w:val="KeywordTok"/>
     <w:basedOn w:val="VerbatimChar"/>
     <w:rPr>
+      <w:rFonts w:ascii="Consolas" w:hAnsi="Consolas"/>
       <w:b/>
-      <w:color w:val="003b4f"/>
-      <w:shd w:val="clear" w:fill="f1f3f5"/>
+      <w:color w:val="003B4F"/>
+      <w:sz w:val="22"/>
+      <w:shd w:val="clear" w:color="auto" w:fill="F1F3F5"/>
     </w:rPr>
   </w:style>
   <w:style w:type="character" w:customStyle="1" w:styleId="DataTypeTok">
     <w:name w:val="DataTypeTok"/>
     <w:basedOn w:val="VerbatimChar"/>
     <w:rPr>
-      <w:color w:val="ad0000"/>
-      <w:shd w:val="clear" w:fill="f1f3f5"/>
+      <w:rFonts w:ascii="Consolas" w:hAnsi="Consolas"/>
+      <w:color w:val="AD0000"/>
+      <w:sz w:val="22"/>
+      <w:shd w:val="clear" w:color="auto" w:fill="F1F3F5"/>
     </w:rPr>
   </w:style>
   <w:style w:type="character" w:customStyle="1" w:styleId="DecValTok">
     <w:name w:val="DecValTok"/>
     <w:basedOn w:val="VerbatimChar"/>
     <w:rPr>
-      <w:color w:val="ad0000"/>
-      <w:shd w:val="clear" w:fill="f1f3f5"/>
+      <w:rFonts w:ascii="Consolas" w:hAnsi="Consolas"/>
+      <w:color w:val="AD0000"/>
+      <w:sz w:val="22"/>
+      <w:shd w:val="clear" w:color="auto" w:fill="F1F3F5"/>
     </w:rPr>
   </w:style>
   <w:style w:type="character" w:customStyle="1" w:styleId="BaseNTok">
     <w:name w:val="BaseNTok"/>
     <w:basedOn w:val="VerbatimChar"/>
     <w:rPr>
-      <w:color w:val="ad0000"/>
-      <w:shd w:val="clear" w:fill="f1f3f5"/>
+      <w:rFonts w:ascii="Consolas" w:hAnsi="Consolas"/>
+      <w:color w:val="AD0000"/>
+      <w:sz w:val="22"/>
+      <w:shd w:val="clear" w:color="auto" w:fill="F1F3F5"/>
     </w:rPr>
   </w:style>
   <w:style w:type="character" w:customStyle="1" w:styleId="FloatTok">
     <w:name w:val="FloatTok"/>
     <w:basedOn w:val="VerbatimChar"/>
     <w:rPr>
-      <w:color w:val="ad0000"/>
-      <w:shd w:val="clear" w:fill="f1f3f5"/>
+      <w:rFonts w:ascii="Consolas" w:hAnsi="Consolas"/>
+      <w:color w:val="AD0000"/>
+      <w:sz w:val="22"/>
+      <w:shd w:val="clear" w:color="auto" w:fill="F1F3F5"/>
     </w:rPr>
   </w:style>
   <w:style w:type="character" w:customStyle="1" w:styleId="ConstantTok">
     <w:name w:val="ConstantTok"/>
     <w:basedOn w:val="VerbatimChar"/>
     <w:rPr>
-      <w:color w:val="8f5902"/>
-      <w:shd w:val="clear" w:fill="f1f3f5"/>
+      <w:rFonts w:ascii="Consolas" w:hAnsi="Consolas"/>
+      <w:color w:val="8F5902"/>
+      <w:sz w:val="22"/>
+      <w:shd w:val="clear" w:color="auto" w:fill="F1F3F5"/>
     </w:rPr>
   </w:style>
   <w:style w:type="character" w:customStyle="1" w:styleId="CharTok">
     <w:name w:val="CharTok"/>
     <w:basedOn w:val="VerbatimChar"/>
     <w:rPr>
-      <w:color w:val="20794d"/>
-      <w:shd w:val="clear" w:fill="f1f3f5"/>
+      <w:rFonts w:ascii="Consolas" w:hAnsi="Consolas"/>
+      <w:color w:val="20794D"/>
+      <w:sz w:val="22"/>
+      <w:shd w:val="clear" w:color="auto" w:fill="F1F3F5"/>
     </w:rPr>
   </w:style>
   <w:style w:type="character" w:customStyle="1" w:styleId="SpecialCharTok">
     <w:name w:val="SpecialCharTok"/>
     <w:basedOn w:val="VerbatimChar"/>
     <w:rPr>
-      <w:color w:val="5e5e5e"/>
-      <w:shd w:val="clear" w:fill="f1f3f5"/>
+      <w:rFonts w:ascii="Consolas" w:hAnsi="Consolas"/>
+      <w:color w:val="5E5E5E"/>
+      <w:sz w:val="22"/>
+      <w:shd w:val="clear" w:color="auto" w:fill="F1F3F5"/>
     </w:rPr>
   </w:style>
   <w:style w:type="character" w:customStyle="1" w:styleId="StringTok">
     <w:name w:val="StringTok"/>
     <w:basedOn w:val="VerbatimChar"/>
     <w:rPr>
-      <w:color w:val="20794d"/>
-      <w:shd w:val="clear" w:fill="f1f3f5"/>
+      <w:rFonts w:ascii="Consolas" w:hAnsi="Consolas"/>
+      <w:color w:val="20794D"/>
+      <w:sz w:val="22"/>
+      <w:shd w:val="clear" w:color="auto" w:fill="F1F3F5"/>
     </w:rPr>
   </w:style>
   <w:style w:type="character" w:customStyle="1" w:styleId="VerbatimStringTok">
     <w:name w:val="VerbatimStringTok"/>
     <w:basedOn w:val="VerbatimChar"/>
     <w:rPr>
-      <w:color w:val="20794d"/>
-      <w:shd w:val="clear" w:fill="f1f3f5"/>
+      <w:rFonts w:ascii="Consolas" w:hAnsi="Consolas"/>
+      <w:color w:val="20794D"/>
+      <w:sz w:val="22"/>
+      <w:shd w:val="clear" w:color="auto" w:fill="F1F3F5"/>
     </w:rPr>
   </w:style>
   <w:style w:type="character" w:customStyle="1" w:styleId="SpecialStringTok">
     <w:name w:val="SpecialStringTok"/>
     <w:basedOn w:val="VerbatimChar"/>
     <w:rPr>
-      <w:color w:val="20794d"/>
-      <w:shd w:val="clear" w:fill="f1f3f5"/>
+      <w:rFonts w:ascii="Consolas" w:hAnsi="Consolas"/>
+      <w:color w:val="20794D"/>
+      <w:sz w:val="22"/>
+      <w:shd w:val="clear" w:color="auto" w:fill="F1F3F5"/>
     </w:rPr>
   </w:style>
   <w:style w:type="character" w:customStyle="1" w:styleId="ImportTok">
     <w:name w:val="ImportTok"/>
     <w:basedOn w:val="VerbatimChar"/>
     <w:rPr>
-      <w:color w:val="00769e"/>
-      <w:shd w:val="clear" w:fill="f1f3f5"/>
+      <w:rFonts w:ascii="Consolas" w:hAnsi="Consolas"/>
+      <w:color w:val="00769E"/>
+      <w:sz w:val="22"/>
+      <w:shd w:val="clear" w:color="auto" w:fill="F1F3F5"/>
     </w:rPr>
   </w:style>
   <w:style w:type="character" w:customStyle="1" w:styleId="CommentTok">
     <w:name w:val="CommentTok"/>
     <w:basedOn w:val="VerbatimChar"/>
     <w:rPr>
-      <w:color w:val="5e5e5e"/>
-      <w:shd w:val="clear" w:fill="f1f3f5"/>
+      <w:rFonts w:ascii="Consolas" w:hAnsi="Consolas"/>
+      <w:color w:val="5E5E5E"/>
+      <w:sz w:val="22"/>
+      <w:shd w:val="clear" w:color="auto" w:fill="F1F3F5"/>
     </w:rPr>
   </w:style>
   <w:style w:type="character" w:customStyle="1" w:styleId="DocumentationTok">
     <w:name w:val="DocumentationTok"/>
     <w:basedOn w:val="VerbatimChar"/>
     <w:rPr>
+      <w:rFonts w:ascii="Consolas" w:hAnsi="Consolas"/>
       <w:i/>
-      <w:color w:val="5e5e5e"/>
-      <w:shd w:val="clear" w:fill="f1f3f5"/>
+      <w:color w:val="5E5E5E"/>
+      <w:sz w:val="22"/>
+      <w:shd w:val="clear" w:color="auto" w:fill="F1F3F5"/>
     </w:rPr>
   </w:style>
   <w:style w:type="character" w:customStyle="1" w:styleId="AnnotationTok">
     <w:name w:val="AnnotationTok"/>
     <w:basedOn w:val="VerbatimChar"/>
     <w:rPr>
-      <w:color w:val="5e5e5e"/>
-      <w:shd w:val="clear" w:fill="f1f3f5"/>
+      <w:rFonts w:ascii="Consolas" w:hAnsi="Consolas"/>
+      <w:color w:val="5E5E5E"/>
+      <w:sz w:val="22"/>
+      <w:shd w:val="clear" w:color="auto" w:fill="F1F3F5"/>
     </w:rPr>
   </w:style>
   <w:style w:type="character" w:customStyle="1" w:styleId="CommentVarTok">
     <w:name w:val="CommentVarTok"/>
     <w:basedOn w:val="VerbatimChar"/>
     <w:rPr>
+      <w:rFonts w:ascii="Consolas" w:hAnsi="Consolas"/>
       <w:i/>
-      <w:color w:val="5e5e5e"/>
-      <w:shd w:val="clear" w:fill="f1f3f5"/>
+      <w:color w:val="5E5E5E"/>
+      <w:sz w:val="22"/>
+      <w:shd w:val="clear" w:color="auto" w:fill="F1F3F5"/>
     </w:rPr>
   </w:style>
   <w:style w:type="character" w:customStyle="1" w:styleId="OtherTok">
     <w:name w:val="OtherTok"/>
     <w:basedOn w:val="VerbatimChar"/>
     <w:rPr>
-      <w:color w:val="003b4f"/>
-      <w:shd w:val="clear" w:fill="f1f3f5"/>
+      <w:rFonts w:ascii="Consolas" w:hAnsi="Consolas"/>
+      <w:color w:val="003B4F"/>
+      <w:sz w:val="22"/>
+      <w:shd w:val="clear" w:color="auto" w:fill="F1F3F5"/>
     </w:rPr>
   </w:style>
   <w:style w:type="character" w:customStyle="1" w:styleId="FunctionTok">
     <w:name w:val="FunctionTok"/>
     <w:basedOn w:val="VerbatimChar"/>
     <w:rPr>
-      <w:color w:val="4758ab"/>
-      <w:shd w:val="clear" w:fill="f1f3f5"/>
+      <w:rFonts w:ascii="Consolas" w:hAnsi="Consolas"/>
+      <w:color w:val="4758AB"/>
+      <w:sz w:val="22"/>
+      <w:shd w:val="clear" w:color="auto" w:fill="F1F3F5"/>
     </w:rPr>
   </w:style>
   <w:style w:type="character" w:customStyle="1" w:styleId="VariableTok">
     <w:name w:val="VariableTok"/>
     <w:basedOn w:val="VerbatimChar"/>
     <w:rPr>
+      <w:rFonts w:ascii="Consolas" w:hAnsi="Consolas"/>
       <w:color w:val="111111"/>
-      <w:shd w:val="clear" w:fill="f1f3f5"/>
+      <w:sz w:val="22"/>
+      <w:shd w:val="clear" w:color="auto" w:fill="F1F3F5"/>
     </w:rPr>
   </w:style>
   <w:style w:type="character" w:customStyle="1" w:styleId="ControlFlowTok">
     <w:name w:val="ControlFlowTok"/>
     <w:basedOn w:val="VerbatimChar"/>
     <w:rPr>
+      <w:rFonts w:ascii="Consolas" w:hAnsi="Consolas"/>
       <w:b/>
-      <w:color w:val="003b4f"/>
-      <w:shd w:val="clear" w:fill="f1f3f5"/>
+      <w:color w:val="003B4F"/>
+      <w:sz w:val="22"/>
+      <w:shd w:val="clear" w:color="auto" w:fill="F1F3F5"/>
     </w:rPr>
   </w:style>
   <w:style w:type="character" w:customStyle="1" w:styleId="OperatorTok">
     <w:name w:val="OperatorTok"/>
     <w:basedOn w:val="VerbatimChar"/>
     <w:rPr>
-      <w:color w:val="5e5e5e"/>
-      <w:shd w:val="clear" w:fill="f1f3f5"/>
+      <w:rFonts w:ascii="Consolas" w:hAnsi="Consolas"/>
+      <w:color w:val="5E5E5E"/>
+      <w:sz w:val="22"/>
+      <w:shd w:val="clear" w:color="auto" w:fill="F1F3F5"/>
     </w:rPr>
   </w:style>
   <w:style w:type="character" w:customStyle="1" w:styleId="BuiltInTok">
     <w:name w:val="BuiltInTok"/>
     <w:basedOn w:val="VerbatimChar"/>
     <w:rPr>
-      <w:color w:val="003b4f"/>
-      <w:shd w:val="clear" w:fill="f1f3f5"/>
+      <w:rFonts w:ascii="Consolas" w:hAnsi="Consolas"/>
+      <w:color w:val="003B4F"/>
+      <w:sz w:val="22"/>
+      <w:shd w:val="clear" w:color="auto" w:fill="F1F3F5"/>
     </w:rPr>
   </w:style>
   <w:style w:type="character" w:customStyle="1" w:styleId="ExtensionTok">
     <w:name w:val="ExtensionTok"/>
     <w:basedOn w:val="VerbatimChar"/>
     <w:rPr>
-      <w:color w:val="003b4f"/>
-      <w:shd w:val="clear" w:fill="f1f3f5"/>
+      <w:rFonts w:ascii="Consolas" w:hAnsi="Consolas"/>
+      <w:color w:val="003B4F"/>
+      <w:sz w:val="22"/>
+      <w:shd w:val="clear" w:color="auto" w:fill="F1F3F5"/>
     </w:rPr>
   </w:style>
   <w:style w:type="character" w:customStyle="1" w:styleId="PreprocessorTok">
     <w:name w:val="PreprocessorTok"/>
     <w:basedOn w:val="VerbatimChar"/>
     <w:rPr>
-      <w:color w:val="ad0000"/>
-      <w:shd w:val="clear" w:fill="f1f3f5"/>
+      <w:rFonts w:ascii="Consolas" w:hAnsi="Consolas"/>
+      <w:color w:val="AD0000"/>
+      <w:sz w:val="22"/>
+      <w:shd w:val="clear" w:color="auto" w:fill="F1F3F5"/>
     </w:rPr>
   </w:style>
   <w:style w:type="character" w:customStyle="1" w:styleId="AttributeTok">
     <w:name w:val="AttributeTok"/>
     <w:basedOn w:val="VerbatimChar"/>
     <w:rPr>
+      <w:rFonts w:ascii="Consolas" w:hAnsi="Consolas"/>
       <w:color w:val="657422"/>
-      <w:shd w:val="clear" w:fill="f1f3f5"/>
+      <w:sz w:val="22"/>
+      <w:shd w:val="clear" w:color="auto" w:fill="F1F3F5"/>
     </w:rPr>
   </w:style>
   <w:style w:type="character" w:customStyle="1" w:styleId="RegionMarkerTok">
     <w:name w:val="RegionMarkerTok"/>
     <w:basedOn w:val="VerbatimChar"/>
     <w:rPr>
-      <w:color w:val="003b4f"/>
-      <w:shd w:val="clear" w:fill="f1f3f5"/>
+      <w:rFonts w:ascii="Consolas" w:hAnsi="Consolas"/>
+      <w:color w:val="003B4F"/>
+      <w:sz w:val="22"/>
+      <w:shd w:val="clear" w:color="auto" w:fill="F1F3F5"/>
     </w:rPr>
   </w:style>
   <w:style w:type="character" w:customStyle="1" w:styleId="InformationTok">
     <w:name w:val="InformationTok"/>
     <w:basedOn w:val="VerbatimChar"/>
     <w:rPr>
-      <w:color w:val="5e5e5e"/>
-      <w:shd w:val="clear" w:fill="f1f3f5"/>
+      <w:rFonts w:ascii="Consolas" w:hAnsi="Consolas"/>
+      <w:color w:val="5E5E5E"/>
+      <w:sz w:val="22"/>
+      <w:shd w:val="clear" w:color="auto" w:fill="F1F3F5"/>
     </w:rPr>
   </w:style>
   <w:style w:type="character" w:customStyle="1" w:styleId="WarningTok">
     <w:name w:val="WarningTok"/>
     <w:basedOn w:val="VerbatimChar"/>
     <w:rPr>
+      <w:rFonts w:ascii="Consolas" w:hAnsi="Consolas"/>
       <w:i/>
-      <w:color w:val="5e5e5e"/>
-      <w:shd w:val="clear" w:fill="f1f3f5"/>
+      <w:color w:val="5E5E5E"/>
+      <w:sz w:val="22"/>
+      <w:shd w:val="clear" w:color="auto" w:fill="F1F3F5"/>
     </w:rPr>
   </w:style>
   <w:style w:type="character" w:customStyle="1" w:styleId="AlertTok">
     <w:name w:val="AlertTok"/>
     <w:basedOn w:val="VerbatimChar"/>
     <w:rPr>
-      <w:color w:val="ad0000"/>
-      <w:shd w:val="clear" w:fill="f1f3f5"/>
+      <w:rFonts w:ascii="Consolas" w:hAnsi="Consolas"/>
+      <w:color w:val="AD0000"/>
+      <w:sz w:val="22"/>
+      <w:shd w:val="clear" w:color="auto" w:fill="F1F3F5"/>
     </w:rPr>
   </w:style>
   <w:style w:type="character" w:customStyle="1" w:styleId="ErrorTok">
     <w:name w:val="ErrorTok"/>
     <w:basedOn w:val="VerbatimChar"/>
     <w:rPr>
-      <w:color w:val="ad0000"/>
-      <w:shd w:val="clear" w:fill="f1f3f5"/>
+      <w:rFonts w:ascii="Consolas" w:hAnsi="Consolas"/>
+      <w:color w:val="AD0000"/>
+      <w:sz w:val="22"/>
+      <w:shd w:val="clear" w:color="auto" w:fill="F1F3F5"/>
     </w:rPr>
   </w:style>
   <w:style w:type="character" w:customStyle="1" w:styleId="NormalTok">
     <w:name w:val="NormalTok"/>
     <w:basedOn w:val="VerbatimChar"/>
     <w:rPr>
-      <w:color w:val="003b4f"/>
-      <w:shd w:val="clear" w:fill="f1f3f5"/>
+      <w:rFonts w:ascii="Consolas" w:hAnsi="Consolas"/>
+      <w:color w:val="003B4F"/>
+      <w:sz w:val="22"/>
+      <w:shd w:val="clear" w:color="auto" w:fill="F1F3F5"/>
     </w:rPr>
   </w:style>
 </w:styles>

</xml_diff>